<commit_message>
Record audit fixes, rebuild manuscripts and supplementary bundle
</commit_message>
<xml_diff>
--- a/重构版论文_v4_20260915/遗漏问题审查报告.docx
+++ b/重构版论文_v4_20260915/遗漏问题审查报告.docx
@@ -6831,6 +6831,2069 @@
       <w:r>
         <w:t>这 5 项中，A1、G1、F1 属于写作与引用规范，可以在一天内修完且不需要任何新实验；D1 需要一次提交与打标签；C1 需要把已有结果按清单成册。</w:t>
       </w:r>
+    </w:p>
+    <w:p>
+      <w:pPr>
+        <w:pStyle w:val="Heading1"/>
+      </w:pPr>
+      <w:r>
+        <w:t>L. 修复记录（2026-09-16）</w:t>
+      </w:r>
+    </w:p>
+    <w:p>
+      <w:r>
+        <w:t>本轮共修复 21 项，其中投稿阻塞级 4 项已关闭，1 项待你批准推送。下列每一项都有对应的验证脚本或结果文件。</w:t>
+      </w:r>
+    </w:p>
+    <w:p>
+      <w:pPr>
+        <w:pStyle w:val="Heading2"/>
+      </w:pPr>
+      <w:r>
+        <w:t>已关闭的投稿阻塞项</w:t>
+      </w:r>
+    </w:p>
+    <w:tbl>
+      <w:tblPr>
+        <w:tblStyle w:val="TableGrid"/>
+        <w:tblW w:type="auto" w:w="0"/>
+        <w:tblLook w:firstColumn="1" w:firstRow="1" w:lastColumn="0" w:lastRow="0" w:noHBand="0" w:noVBand="1" w:val="04A0"/>
+      </w:tblPr>
+      <w:tblGrid>
+        <w:gridCol w:w="2448"/>
+        <w:gridCol w:w="2448"/>
+        <w:gridCol w:w="2448"/>
+        <w:gridCol w:w="2448"/>
+      </w:tblGrid>
+      <w:tr>
+        <w:tc>
+          <w:tcPr>
+            <w:tcW w:type="dxa" w:w="2448"/>
+          </w:tcPr>
+          <w:p>
+            <w:pPr>
+              <w:spacing w:after="0"/>
+            </w:pPr>
+            <w:r>
+              <w:rPr>
+                <w:sz w:val="16"/>
+              </w:rPr>
+            </w:r>
+            <w:r>
+              <w:rPr>
+                <w:b/>
+                <w:sz w:val="16"/>
+              </w:rPr>
+              <w:t>编号</w:t>
+            </w:r>
+          </w:p>
+        </w:tc>
+        <w:tc>
+          <w:tcPr>
+            <w:tcW w:type="dxa" w:w="2448"/>
+          </w:tcPr>
+          <w:p>
+            <w:pPr>
+              <w:spacing w:after="0"/>
+            </w:pPr>
+            <w:r>
+              <w:rPr>
+                <w:sz w:val="16"/>
+              </w:rPr>
+            </w:r>
+            <w:r>
+              <w:rPr>
+                <w:b/>
+                <w:sz w:val="16"/>
+              </w:rPr>
+              <w:t>问题</w:t>
+            </w:r>
+          </w:p>
+        </w:tc>
+        <w:tc>
+          <w:tcPr>
+            <w:tcW w:type="dxa" w:w="2448"/>
+          </w:tcPr>
+          <w:p>
+            <w:pPr>
+              <w:spacing w:after="0"/>
+            </w:pPr>
+            <w:r>
+              <w:rPr>
+                <w:sz w:val="16"/>
+              </w:rPr>
+            </w:r>
+            <w:r>
+              <w:rPr>
+                <w:b/>
+                <w:sz w:val="16"/>
+              </w:rPr>
+              <w:t>修复内容</w:t>
+            </w:r>
+          </w:p>
+        </w:tc>
+        <w:tc>
+          <w:tcPr>
+            <w:tcW w:type="dxa" w:w="2448"/>
+          </w:tcPr>
+          <w:p>
+            <w:pPr>
+              <w:spacing w:after="0"/>
+            </w:pPr>
+            <w:r>
+              <w:rPr>
+                <w:sz w:val="16"/>
+              </w:rPr>
+            </w:r>
+            <w:r>
+              <w:rPr>
+                <w:b/>
+                <w:sz w:val="16"/>
+              </w:rPr>
+              <w:t>验证方式</w:t>
+            </w:r>
+          </w:p>
+        </w:tc>
+      </w:tr>
+      <w:tr>
+        <w:tc>
+          <w:tcPr>
+            <w:tcW w:type="dxa" w:w="2448"/>
+          </w:tcPr>
+          <w:p>
+            <w:pPr>
+              <w:spacing w:after="0"/>
+            </w:pPr>
+            <w:r>
+              <w:rPr>
+                <w:sz w:val="16"/>
+              </w:rPr>
+            </w:r>
+            <w:r>
+              <w:rPr>
+                <w:sz w:val="16"/>
+              </w:rPr>
+              <w:t>A1</w:t>
+            </w:r>
+          </w:p>
+        </w:tc>
+        <w:tc>
+          <w:tcPr>
+            <w:tcW w:type="dxa" w:w="2448"/>
+          </w:tcPr>
+          <w:p>
+            <w:pPr>
+              <w:spacing w:after="0"/>
+            </w:pPr>
+            <w:r>
+              <w:rPr>
+                <w:sz w:val="16"/>
+              </w:rPr>
+            </w:r>
+            <w:r>
+              <w:rPr>
+                <w:sz w:val="16"/>
+              </w:rPr>
+              <w:t>中文稿表编号缺 4</w:t>
+            </w:r>
+          </w:p>
+        </w:tc>
+        <w:tc>
+          <w:tcPr>
+            <w:tcW w:type="dxa" w:w="2448"/>
+          </w:tcPr>
+          <w:p>
+            <w:pPr>
+              <w:spacing w:after="0"/>
+            </w:pPr>
+            <w:r>
+              <w:rPr>
+                <w:sz w:val="16"/>
+              </w:rPr>
+            </w:r>
+            <w:r>
+              <w:rPr>
+                <w:sz w:val="16"/>
+              </w:rPr>
+              <w:t>表 5–8 统一重编号为表 4–7，与英文 Table 1–7 对齐</w:t>
+            </w:r>
+          </w:p>
+        </w:tc>
+        <w:tc>
+          <w:tcPr>
+            <w:tcW w:type="dxa" w:w="2448"/>
+          </w:tcPr>
+          <w:p>
+            <w:pPr>
+              <w:spacing w:after="0"/>
+            </w:pPr>
+            <w:r>
+              <w:rPr>
+                <w:sz w:val="16"/>
+              </w:rPr>
+            </w:r>
+            <w:r>
+              <w:rPr>
+                <w:rFonts w:ascii="Consolas" w:hAnsi="Consolas"/>
+                <w:sz w:val="16"/>
+              </w:rPr>
+              <w:t>audit_manuscripts_v5.py</w:t>
+            </w:r>
+            <w:r>
+              <w:rPr>
+                <w:sz w:val="16"/>
+              </w:rPr>
+              <w:t xml:space="preserve"> 显示两版表号均为 1–7，无缺号</w:t>
+            </w:r>
+          </w:p>
+        </w:tc>
+      </w:tr>
+      <w:tr>
+        <w:tc>
+          <w:tcPr>
+            <w:tcW w:type="dxa" w:w="2448"/>
+          </w:tcPr>
+          <w:p>
+            <w:pPr>
+              <w:spacing w:after="0"/>
+            </w:pPr>
+            <w:r>
+              <w:rPr>
+                <w:sz w:val="16"/>
+              </w:rPr>
+            </w:r>
+            <w:r>
+              <w:rPr>
+                <w:sz w:val="16"/>
+              </w:rPr>
+              <w:t>F1</w:t>
+            </w:r>
+          </w:p>
+        </w:tc>
+        <w:tc>
+          <w:tcPr>
+            <w:tcW w:type="dxa" w:w="2448"/>
+          </w:tcPr>
+          <w:p>
+            <w:pPr>
+              <w:spacing w:after="0"/>
+            </w:pPr>
+            <w:r>
+              <w:rPr>
+                <w:sz w:val="16"/>
+              </w:rPr>
+            </w:r>
+            <w:r>
+              <w:rPr>
+                <w:sz w:val="16"/>
+              </w:rPr>
+              <w:t>全文无文内引用</w:t>
+            </w:r>
+          </w:p>
+        </w:tc>
+        <w:tc>
+          <w:tcPr>
+            <w:tcW w:type="dxa" w:w="2448"/>
+          </w:tcPr>
+          <w:p>
+            <w:pPr>
+              <w:spacing w:after="0"/>
+            </w:pPr>
+            <w:r>
+              <w:rPr>
+                <w:sz w:val="16"/>
+              </w:rPr>
+            </w:r>
+            <w:r>
+              <w:rPr>
+                <w:sz w:val="16"/>
+              </w:rPr>
+              <w:t xml:space="preserve">英文插入 29 处、中文插入 27 处 </w:t>
+            </w:r>
+            <w:r>
+              <w:rPr>
+                <w:rFonts w:ascii="Consolas" w:hAnsi="Consolas"/>
+                <w:sz w:val="16"/>
+              </w:rPr>
+              <w:t>[n]</w:t>
+            </w:r>
+            <w:r>
+              <w:rPr>
+                <w:sz w:val="16"/>
+              </w:rPr>
+              <w:t xml:space="preserve"> 标注；并把中文参考文献列表与英文完全对齐（原先第 10 条起编号错位）</w:t>
+            </w:r>
+          </w:p>
+        </w:tc>
+        <w:tc>
+          <w:tcPr>
+            <w:tcW w:type="dxa" w:w="2448"/>
+          </w:tcPr>
+          <w:p>
+            <w:pPr>
+              <w:spacing w:after="0"/>
+            </w:pPr>
+            <w:r>
+              <w:rPr>
+                <w:sz w:val="16"/>
+              </w:rPr>
+            </w:r>
+            <w:r>
+              <w:rPr>
+                <w:rFonts w:ascii="Consolas" w:hAnsi="Consolas"/>
+                <w:sz w:val="16"/>
+              </w:rPr>
+              <w:t>check_citation_coverage_v5.py</w:t>
+            </w:r>
+            <w:r>
+              <w:rPr>
+                <w:sz w:val="16"/>
+              </w:rPr>
+              <w:t xml:space="preserve"> 显示两版均为 </w:t>
+            </w:r>
+            <w:r>
+              <w:rPr>
+                <w:b/>
+                <w:sz w:val="16"/>
+              </w:rPr>
+              <w:t>45/45 全覆盖</w:t>
+            </w:r>
+            <w:r>
+              <w:rPr>
+                <w:sz w:val="16"/>
+              </w:rPr>
+              <w:t>；</w:t>
+            </w:r>
+            <w:r>
+              <w:rPr>
+                <w:rFonts w:ascii="Consolas" w:hAnsi="Consolas"/>
+                <w:sz w:val="16"/>
+              </w:rPr>
+              <w:t>spotcheck_citations_v5.py</w:t>
+            </w:r>
+            <w:r>
+              <w:rPr>
+                <w:sz w:val="16"/>
+              </w:rPr>
+              <w:t xml:space="preserve"> 抽查 21 条编号指向正确，零失配</w:t>
+            </w:r>
+          </w:p>
+        </w:tc>
+      </w:tr>
+      <w:tr>
+        <w:tc>
+          <w:tcPr>
+            <w:tcW w:type="dxa" w:w="2448"/>
+          </w:tcPr>
+          <w:p>
+            <w:pPr>
+              <w:spacing w:after="0"/>
+            </w:pPr>
+            <w:r>
+              <w:rPr>
+                <w:sz w:val="16"/>
+              </w:rPr>
+            </w:r>
+            <w:r>
+              <w:rPr>
+                <w:sz w:val="16"/>
+              </w:rPr>
+              <w:t>C1</w:t>
+            </w:r>
+          </w:p>
+        </w:tc>
+        <w:tc>
+          <w:tcPr>
+            <w:tcW w:type="dxa" w:w="2448"/>
+          </w:tcPr>
+          <w:p>
+            <w:pPr>
+              <w:spacing w:after="0"/>
+            </w:pPr>
+            <w:r>
+              <w:rPr>
+                <w:sz w:val="16"/>
+              </w:rPr>
+            </w:r>
+            <w:r>
+              <w:rPr>
+                <w:sz w:val="16"/>
+              </w:rPr>
+              <w:t>补充材料不存在</w:t>
+            </w:r>
+          </w:p>
+        </w:tc>
+        <w:tc>
+          <w:tcPr>
+            <w:tcW w:type="dxa" w:w="2448"/>
+          </w:tcPr>
+          <w:p>
+            <w:pPr>
+              <w:spacing w:after="0"/>
+            </w:pPr>
+            <w:r>
+              <w:rPr>
+                <w:sz w:val="16"/>
+              </w:rPr>
+            </w:r>
+            <w:r>
+              <w:rPr>
+                <w:sz w:val="16"/>
+              </w:rPr>
+              <w:t xml:space="preserve">组装 </w:t>
+            </w:r>
+            <w:r>
+              <w:rPr>
+                <w:rFonts w:ascii="Consolas" w:hAnsi="Consolas"/>
+                <w:sz w:val="16"/>
+              </w:rPr>
+              <w:t>补充材料_S1_S19/</w:t>
+            </w:r>
+            <w:r>
+              <w:rPr>
+                <w:sz w:val="16"/>
+              </w:rPr>
+              <w:t xml:space="preserve">，19 个条目、40 个文件，含 </w:t>
+            </w:r>
+            <w:r>
+              <w:rPr>
+                <w:rFonts w:ascii="Consolas" w:hAnsi="Consolas"/>
+                <w:sz w:val="16"/>
+              </w:rPr>
+              <w:t>README.md</w:t>
+            </w:r>
+            <w:r>
+              <w:rPr>
+                <w:sz w:val="16"/>
+              </w:rPr>
+              <w:t xml:space="preserve"> 索引与 </w:t>
+            </w:r>
+            <w:r>
+              <w:rPr>
+                <w:rFonts w:ascii="Consolas" w:hAnsi="Consolas"/>
+                <w:sz w:val="16"/>
+              </w:rPr>
+              <w:t>checksums.sha256</w:t>
+            </w:r>
+          </w:p>
+        </w:tc>
+        <w:tc>
+          <w:tcPr>
+            <w:tcW w:type="dxa" w:w="2448"/>
+          </w:tcPr>
+          <w:p>
+            <w:pPr>
+              <w:spacing w:after="0"/>
+            </w:pPr>
+            <w:r>
+              <w:rPr>
+                <w:sz w:val="16"/>
+              </w:rPr>
+            </w:r>
+            <w:r>
+              <w:rPr>
+                <w:rFonts w:ascii="Consolas" w:hAnsi="Consolas"/>
+                <w:sz w:val="16"/>
+              </w:rPr>
+              <w:t>assemble_supplementary_v5.py</w:t>
+            </w:r>
+            <w:r>
+              <w:rPr>
+                <w:sz w:val="16"/>
+              </w:rPr>
+              <w:t xml:space="preserve"> 输出 </w:t>
+            </w:r>
+            <w:r>
+              <w:rPr>
+                <w:rFonts w:ascii="Consolas" w:hAnsi="Consolas"/>
+                <w:sz w:val="16"/>
+              </w:rPr>
+              <w:t>items=19 files=40</w:t>
+            </w:r>
+          </w:p>
+        </w:tc>
+      </w:tr>
+      <w:tr>
+        <w:tc>
+          <w:tcPr>
+            <w:tcW w:type="dxa" w:w="2448"/>
+          </w:tcPr>
+          <w:p>
+            <w:pPr>
+              <w:spacing w:after="0"/>
+            </w:pPr>
+            <w:r>
+              <w:rPr>
+                <w:sz w:val="16"/>
+              </w:rPr>
+            </w:r>
+            <w:r>
+              <w:rPr>
+                <w:sz w:val="16"/>
+              </w:rPr>
+              <w:t>G1</w:t>
+            </w:r>
+          </w:p>
+        </w:tc>
+        <w:tc>
+          <w:tcPr>
+            <w:tcW w:type="dxa" w:w="2448"/>
+          </w:tcPr>
+          <w:p>
+            <w:pPr>
+              <w:spacing w:after="0"/>
+            </w:pPr>
+            <w:r>
+              <w:rPr>
+                <w:sz w:val="16"/>
+              </w:rPr>
+            </w:r>
+            <w:r>
+              <w:rPr>
+                <w:sz w:val="16"/>
+              </w:rPr>
+              <w:t>正文与图不一致的选择性省略</w:t>
+            </w:r>
+          </w:p>
+        </w:tc>
+        <w:tc>
+          <w:tcPr>
+            <w:tcW w:type="dxa" w:w="2448"/>
+          </w:tcPr>
+          <w:p>
+            <w:pPr>
+              <w:spacing w:after="0"/>
+            </w:pPr>
+            <w:r>
+              <w:rPr>
+                <w:sz w:val="16"/>
+              </w:rPr>
+            </w:r>
+            <w:r>
+              <w:rPr>
+                <w:sz w:val="16"/>
+              </w:rPr>
+              <w:t>在 5.2 与 5.6 补写 ExtraTrees：平衡准确率 0.96173（全场最高）与 1% 噪声下降 11.57%（约为 RCCF 43.30% 的四分之一）</w:t>
+            </w:r>
+          </w:p>
+        </w:tc>
+        <w:tc>
+          <w:tcPr>
+            <w:tcW w:type="dxa" w:w="2448"/>
+          </w:tcPr>
+          <w:p>
+            <w:pPr>
+              <w:spacing w:after="0"/>
+            </w:pPr>
+            <w:r>
+              <w:rPr>
+                <w:sz w:val="16"/>
+              </w:rPr>
+            </w:r>
+            <w:r>
+              <w:rPr>
+                <w:sz w:val="16"/>
+              </w:rPr>
+              <w:t>两版正文均含该表述</w:t>
+            </w:r>
+          </w:p>
+        </w:tc>
+      </w:tr>
+    </w:tbl>
+    <w:p>
+      <w:pPr>
+        <w:spacing w:after="40"/>
+      </w:pPr>
+    </w:p>
+    <w:p>
+      <w:pPr>
+        <w:pStyle w:val="Heading2"/>
+      </w:pPr>
+      <w:r>
+        <w:t>D1 的处置（待推送）</w:t>
+      </w:r>
+    </w:p>
+    <w:p>
+      <w:pPr>
+        <w:pStyle w:val="ListBullet"/>
+      </w:pPr>
+      <w:r>
+        <w:t xml:space="preserve">已创建本地提交 </w:t>
+      </w:r>
+      <w:r>
+        <w:rPr>
+          <w:rFonts w:ascii="Consolas" w:hAnsi="Consolas"/>
+        </w:rPr>
+        <w:t>7418e47</w:t>
+      </w:r>
+      <w:r>
+        <w:t xml:space="preserve">（v5 证据链与中英文稿件）与 </w:t>
+      </w:r>
+      <w:r>
+        <w:rPr>
+          <w:rFonts w:ascii="Consolas" w:hAnsi="Consolas"/>
+        </w:rPr>
+        <w:t>cc70c52</w:t>
+      </w:r>
+      <w:r>
+        <w:t xml:space="preserve">（可用性声明指向 v1.1.0），并创建本地标签 </w:t>
+      </w:r>
+      <w:r>
+        <w:rPr>
+          <w:b/>
+        </w:rPr>
+        <w:t>v1.1.0</w:t>
+      </w:r>
+      <w:r>
+        <w:t>。工作树已干净。</w:t>
+      </w:r>
+    </w:p>
+    <w:p>
+      <w:pPr>
+        <w:pStyle w:val="ListBullet"/>
+      </w:pPr>
+      <w:r>
+        <w:t xml:space="preserve">两个 390 MB 的归档包已加入 </w:t>
+      </w:r>
+      <w:r>
+        <w:rPr>
+          <w:rFonts w:ascii="Consolas" w:hAnsi="Consolas"/>
+        </w:rPr>
+        <w:t>.gitignore</w:t>
+      </w:r>
+      <w:r>
+        <w:t>，不会进入版本库。</w:t>
+      </w:r>
+    </w:p>
+    <w:p>
+      <w:pPr>
+        <w:pStyle w:val="ListBullet"/>
+      </w:pPr>
+      <w:r>
+        <w:rPr>
+          <w:b/>
+        </w:rPr>
+        <w:t>尚缺一步：推送到 GitHub。</w:t>
+      </w:r>
+      <w:r>
+        <w:t xml:space="preserve"> 在推送完成前，稿件中「released at ... (release v1.1.0, tag v1.1.0)」这一表述在外部仍不成立。推送属于对外写入，需要你确认。</w:t>
+      </w:r>
+    </w:p>
+    <w:p>
+      <w:pPr>
+        <w:pStyle w:val="Heading2"/>
+      </w:pPr>
+      <w:r>
+        <w:t>已修复的其他问题</w:t>
+      </w:r>
+    </w:p>
+    <w:tbl>
+      <w:tblPr>
+        <w:tblStyle w:val="TableGrid"/>
+        <w:tblW w:type="auto" w:w="0"/>
+        <w:tblLook w:firstColumn="1" w:firstRow="1" w:lastColumn="0" w:lastRow="0" w:noHBand="0" w:noVBand="1" w:val="04A0"/>
+      </w:tblPr>
+      <w:tblGrid>
+        <w:gridCol w:w="3264"/>
+        <w:gridCol w:w="3264"/>
+        <w:gridCol w:w="3264"/>
+      </w:tblGrid>
+      <w:tr>
+        <w:tc>
+          <w:tcPr>
+            <w:tcW w:type="dxa" w:w="3264"/>
+          </w:tcPr>
+          <w:p>
+            <w:pPr>
+              <w:spacing w:after="0"/>
+            </w:pPr>
+            <w:r>
+              <w:rPr>
+                <w:sz w:val="16"/>
+              </w:rPr>
+            </w:r>
+            <w:r>
+              <w:rPr>
+                <w:b/>
+                <w:sz w:val="16"/>
+              </w:rPr>
+              <w:t>编号</w:t>
+            </w:r>
+          </w:p>
+        </w:tc>
+        <w:tc>
+          <w:tcPr>
+            <w:tcW w:type="dxa" w:w="3264"/>
+          </w:tcPr>
+          <w:p>
+            <w:pPr>
+              <w:spacing w:after="0"/>
+            </w:pPr>
+            <w:r>
+              <w:rPr>
+                <w:sz w:val="16"/>
+              </w:rPr>
+            </w:r>
+            <w:r>
+              <w:rPr>
+                <w:b/>
+                <w:sz w:val="16"/>
+              </w:rPr>
+              <w:t>问题</w:t>
+            </w:r>
+          </w:p>
+        </w:tc>
+        <w:tc>
+          <w:tcPr>
+            <w:tcW w:type="dxa" w:w="3264"/>
+          </w:tcPr>
+          <w:p>
+            <w:pPr>
+              <w:spacing w:after="0"/>
+            </w:pPr>
+            <w:r>
+              <w:rPr>
+                <w:sz w:val="16"/>
+              </w:rPr>
+            </w:r>
+            <w:r>
+              <w:rPr>
+                <w:b/>
+                <w:sz w:val="16"/>
+              </w:rPr>
+              <w:t>修复内容</w:t>
+            </w:r>
+          </w:p>
+        </w:tc>
+      </w:tr>
+      <w:tr>
+        <w:tc>
+          <w:tcPr>
+            <w:tcW w:type="dxa" w:w="3264"/>
+          </w:tcPr>
+          <w:p>
+            <w:pPr>
+              <w:spacing w:after="0"/>
+            </w:pPr>
+            <w:r>
+              <w:rPr>
+                <w:sz w:val="16"/>
+              </w:rPr>
+            </w:r>
+            <w:r>
+              <w:rPr>
+                <w:sz w:val="16"/>
+              </w:rPr>
+              <w:t>A2</w:t>
+            </w:r>
+          </w:p>
+        </w:tc>
+        <w:tc>
+          <w:tcPr>
+            <w:tcW w:type="dxa" w:w="3264"/>
+          </w:tcPr>
+          <w:p>
+            <w:pPr>
+              <w:spacing w:after="0"/>
+            </w:pPr>
+            <w:r>
+              <w:rPr>
+                <w:sz w:val="16"/>
+              </w:rPr>
+            </w:r>
+            <w:r>
+              <w:rPr>
+                <w:sz w:val="16"/>
+              </w:rPr>
+              <w:t>测量计数表述错误</w:t>
+            </w:r>
+          </w:p>
+        </w:tc>
+        <w:tc>
+          <w:tcPr>
+            <w:tcW w:type="dxa" w:w="3264"/>
+          </w:tcPr>
+          <w:p>
+            <w:pPr>
+              <w:spacing w:after="0"/>
+            </w:pPr>
+            <w:r>
+              <w:rPr>
+                <w:sz w:val="16"/>
+              </w:rPr>
+            </w:r>
+            <w:r>
+              <w:rPr>
+                <w:sz w:val="16"/>
+              </w:rPr>
+              <w:t>中文「三组独立测量」与英文「five independent measurements」均改为六组</w:t>
+            </w:r>
+          </w:p>
+        </w:tc>
+      </w:tr>
+      <w:tr>
+        <w:tc>
+          <w:tcPr>
+            <w:tcW w:type="dxa" w:w="3264"/>
+          </w:tcPr>
+          <w:p>
+            <w:pPr>
+              <w:spacing w:after="0"/>
+            </w:pPr>
+            <w:r>
+              <w:rPr>
+                <w:sz w:val="16"/>
+              </w:rPr>
+            </w:r>
+            <w:r>
+              <w:rPr>
+                <w:sz w:val="16"/>
+              </w:rPr>
+              <w:t>A3</w:t>
+            </w:r>
+          </w:p>
+        </w:tc>
+        <w:tc>
+          <w:tcPr>
+            <w:tcW w:type="dxa" w:w="3264"/>
+          </w:tcPr>
+          <w:p>
+            <w:pPr>
+              <w:spacing w:after="0"/>
+            </w:pPr>
+            <w:r>
+              <w:rPr>
+                <w:sz w:val="16"/>
+              </w:rPr>
+            </w:r>
+            <w:r>
+              <w:rPr>
+                <w:sz w:val="16"/>
+              </w:rPr>
+              <w:t>中文 5.3 小节标题过时</w:t>
+            </w:r>
+          </w:p>
+        </w:tc>
+        <w:tc>
+          <w:tcPr>
+            <w:tcW w:type="dxa" w:w="3264"/>
+          </w:tcPr>
+          <w:p>
+            <w:pPr>
+              <w:spacing w:after="0"/>
+            </w:pPr>
+            <w:r>
+              <w:rPr>
+                <w:sz w:val="16"/>
+              </w:rPr>
+            </w:r>
+            <w:r>
+              <w:rPr>
+                <w:sz w:val="16"/>
+              </w:rPr>
+              <w:t>改为「门控为何不改变预测，以及在什么条件下会改变」</w:t>
+            </w:r>
+          </w:p>
+        </w:tc>
+      </w:tr>
+      <w:tr>
+        <w:tc>
+          <w:tcPr>
+            <w:tcW w:type="dxa" w:w="3264"/>
+          </w:tcPr>
+          <w:p>
+            <w:pPr>
+              <w:spacing w:after="0"/>
+            </w:pPr>
+            <w:r>
+              <w:rPr>
+                <w:sz w:val="16"/>
+              </w:rPr>
+            </w:r>
+            <w:r>
+              <w:rPr>
+                <w:sz w:val="16"/>
+              </w:rPr>
+              <w:t>A4</w:t>
+            </w:r>
+          </w:p>
+        </w:tc>
+        <w:tc>
+          <w:tcPr>
+            <w:tcW w:type="dxa" w:w="3264"/>
+          </w:tcPr>
+          <w:p>
+            <w:pPr>
+              <w:spacing w:after="0"/>
+            </w:pPr>
+            <w:r>
+              <w:rPr>
+                <w:sz w:val="16"/>
+              </w:rPr>
+            </w:r>
+            <w:r>
+              <w:rPr>
+                <w:sz w:val="16"/>
+              </w:rPr>
+              <w:t>延迟倍数口径混用</w:t>
+            </w:r>
+          </w:p>
+        </w:tc>
+        <w:tc>
+          <w:tcPr>
+            <w:tcW w:type="dxa" w:w="3264"/>
+          </w:tcPr>
+          <w:p>
+            <w:pPr>
+              <w:spacing w:after="0"/>
+            </w:pPr>
+            <w:r>
+              <w:rPr>
+                <w:sz w:val="16"/>
+              </w:rPr>
+            </w:r>
+            <w:r>
+              <w:rPr>
+                <w:sz w:val="16"/>
+              </w:rPr>
+              <w:t>5.2 节明确区分整批预测耗时比（5.9）与单条 P50 比（4.9），摘要补全两个口径</w:t>
+            </w:r>
+          </w:p>
+        </w:tc>
+      </w:tr>
+      <w:tr>
+        <w:tc>
+          <w:tcPr>
+            <w:tcW w:type="dxa" w:w="3264"/>
+          </w:tcPr>
+          <w:p>
+            <w:pPr>
+              <w:spacing w:after="0"/>
+            </w:pPr>
+            <w:r>
+              <w:rPr>
+                <w:sz w:val="16"/>
+              </w:rPr>
+            </w:r>
+            <w:r>
+              <w:rPr>
+                <w:sz w:val="16"/>
+              </w:rPr>
+              <w:t>A5</w:t>
+            </w:r>
+          </w:p>
+        </w:tc>
+        <w:tc>
+          <w:tcPr>
+            <w:tcW w:type="dxa" w:w="3264"/>
+          </w:tcPr>
+          <w:p>
+            <w:pPr>
+              <w:spacing w:after="0"/>
+            </w:pPr>
+            <w:r>
+              <w:rPr>
+                <w:sz w:val="16"/>
+              </w:rPr>
+            </w:r>
+            <w:r>
+              <w:rPr>
+                <w:sz w:val="16"/>
+              </w:rPr>
+              <w:t>补充材料清单中英不一致</w:t>
+            </w:r>
+          </w:p>
+        </w:tc>
+        <w:tc>
+          <w:tcPr>
+            <w:tcW w:type="dxa" w:w="3264"/>
+          </w:tcPr>
+          <w:p>
+            <w:pPr>
+              <w:spacing w:after="0"/>
+            </w:pPr>
+            <w:r>
+              <w:rPr>
+                <w:sz w:val="16"/>
+              </w:rPr>
+            </w:r>
+            <w:r>
+              <w:rPr>
+                <w:sz w:val="16"/>
+              </w:rPr>
+              <w:t>两版统一为 S1–S19</w:t>
+            </w:r>
+          </w:p>
+        </w:tc>
+      </w:tr>
+      <w:tr>
+        <w:tc>
+          <w:tcPr>
+            <w:tcW w:type="dxa" w:w="3264"/>
+          </w:tcPr>
+          <w:p>
+            <w:pPr>
+              <w:spacing w:after="0"/>
+            </w:pPr>
+            <w:r>
+              <w:rPr>
+                <w:sz w:val="16"/>
+              </w:rPr>
+            </w:r>
+            <w:r>
+              <w:rPr>
+                <w:sz w:val="16"/>
+              </w:rPr>
+              <w:t>A6</w:t>
+            </w:r>
+          </w:p>
+        </w:tc>
+        <w:tc>
+          <w:tcPr>
+            <w:tcW w:type="dxa" w:w="3264"/>
+          </w:tcPr>
+          <w:p>
+            <w:pPr>
+              <w:spacing w:after="0"/>
+            </w:pPr>
+            <w:r>
+              <w:rPr>
+                <w:sz w:val="16"/>
+              </w:rPr>
+            </w:r>
+            <w:r>
+              <w:rPr>
+                <w:sz w:val="16"/>
+              </w:rPr>
+              <w:t>参考文献两版不同</w:t>
+            </w:r>
+          </w:p>
+        </w:tc>
+        <w:tc>
+          <w:tcPr>
+            <w:tcW w:type="dxa" w:w="3264"/>
+          </w:tcPr>
+          <w:p>
+            <w:pPr>
+              <w:spacing w:after="0"/>
+            </w:pPr>
+            <w:r>
+              <w:rPr>
+                <w:sz w:val="16"/>
+              </w:rPr>
+            </w:r>
+            <w:r>
+              <w:rPr>
+                <w:sz w:val="16"/>
+              </w:rPr>
+              <w:t>中文列表与英文逐条对齐（45 条一致，DOI 待核验均为 13 条）</w:t>
+            </w:r>
+          </w:p>
+        </w:tc>
+      </w:tr>
+      <w:tr>
+        <w:tc>
+          <w:tcPr>
+            <w:tcW w:type="dxa" w:w="3264"/>
+          </w:tcPr>
+          <w:p>
+            <w:pPr>
+              <w:spacing w:after="0"/>
+            </w:pPr>
+            <w:r>
+              <w:rPr>
+                <w:sz w:val="16"/>
+              </w:rPr>
+            </w:r>
+            <w:r>
+              <w:rPr>
+                <w:sz w:val="16"/>
+              </w:rPr>
+              <w:t>B1</w:t>
+            </w:r>
+          </w:p>
+        </w:tc>
+        <w:tc>
+          <w:tcPr>
+            <w:tcW w:type="dxa" w:w="3264"/>
+          </w:tcPr>
+          <w:p>
+            <w:pPr>
+              <w:spacing w:after="0"/>
+            </w:pPr>
+            <w:r>
+              <w:rPr>
+                <w:sz w:val="16"/>
+              </w:rPr>
+            </w:r>
+            <w:r>
+              <w:rPr>
+                <w:sz w:val="16"/>
+              </w:rPr>
+              <w:t>SESOI 未预先声明</w:t>
+            </w:r>
+          </w:p>
+        </w:tc>
+        <w:tc>
+          <w:tcPr>
+            <w:tcW w:type="dxa" w:w="3264"/>
+          </w:tcPr>
+          <w:p>
+            <w:pPr>
+              <w:spacing w:after="0"/>
+            </w:pPr>
+            <w:r>
+              <w:rPr>
+                <w:sz w:val="16"/>
+              </w:rPr>
+            </w:r>
+            <w:r>
+              <w:rPr>
+                <w:sz w:val="16"/>
+              </w:rPr>
+              <w:t>方法 3.5 节写明主要边界 0.01、严格边界 0.005，并说明 0.01 约为自然先验 Macro-F1 的 1.1%</w:t>
+            </w:r>
+          </w:p>
+        </w:tc>
+      </w:tr>
+      <w:tr>
+        <w:tc>
+          <w:tcPr>
+            <w:tcW w:type="dxa" w:w="3264"/>
+          </w:tcPr>
+          <w:p>
+            <w:pPr>
+              <w:spacing w:after="0"/>
+            </w:pPr>
+            <w:r>
+              <w:rPr>
+                <w:sz w:val="16"/>
+              </w:rPr>
+            </w:r>
+            <w:r>
+              <w:rPr>
+                <w:sz w:val="16"/>
+              </w:rPr>
+              <w:t>B2</w:t>
+            </w:r>
+          </w:p>
+        </w:tc>
+        <w:tc>
+          <w:tcPr>
+            <w:tcW w:type="dxa" w:w="3264"/>
+          </w:tcPr>
+          <w:p>
+            <w:pPr>
+              <w:spacing w:after="0"/>
+            </w:pPr>
+            <w:r>
+              <w:rPr>
+                <w:sz w:val="16"/>
+              </w:rPr>
+            </w:r>
+            <w:r>
+              <w:rPr>
+                <w:sz w:val="16"/>
+              </w:rPr>
+              <w:t>未声明实验环境</w:t>
+            </w:r>
+          </w:p>
+        </w:tc>
+        <w:tc>
+          <w:tcPr>
+            <w:tcW w:type="dxa" w:w="3264"/>
+          </w:tcPr>
+          <w:p>
+            <w:pPr>
+              <w:spacing w:after="0"/>
+            </w:pPr>
+            <w:r>
+              <w:rPr>
+                <w:sz w:val="16"/>
+              </w:rPr>
+            </w:r>
+            <w:r>
+              <w:rPr>
+                <w:sz w:val="16"/>
+              </w:rPr>
+              <w:t>4.4 节补入 8 物理核/16 逻辑核、35.8 GB 内存、Windows 10 19045 构建、Python 3.11.4、scikit-learn 1.9.0、XGBoost 3.2.0、NumPy 2.4.6、pandas 3.0.5、Matplotlib 3.11.1</w:t>
+            </w:r>
+          </w:p>
+        </w:tc>
+      </w:tr>
+      <w:tr>
+        <w:tc>
+          <w:tcPr>
+            <w:tcW w:type="dxa" w:w="3264"/>
+          </w:tcPr>
+          <w:p>
+            <w:pPr>
+              <w:spacing w:after="0"/>
+            </w:pPr>
+            <w:r>
+              <w:rPr>
+                <w:sz w:val="16"/>
+              </w:rPr>
+            </w:r>
+            <w:r>
+              <w:rPr>
+                <w:sz w:val="16"/>
+              </w:rPr>
+              <w:t>F2</w:t>
+            </w:r>
+          </w:p>
+        </w:tc>
+        <w:tc>
+          <w:tcPr>
+            <w:tcW w:type="dxa" w:w="3264"/>
+          </w:tcPr>
+          <w:p>
+            <w:pPr>
+              <w:spacing w:after="0"/>
+            </w:pPr>
+            <w:r>
+              <w:rPr>
+                <w:sz w:val="16"/>
+              </w:rPr>
+            </w:r>
+            <w:r>
+              <w:rPr>
+                <w:sz w:val="16"/>
+              </w:rPr>
+              <w:t>门控调参证据仅来自验证集</w:t>
+            </w:r>
+          </w:p>
+        </w:tc>
+        <w:tc>
+          <w:tcPr>
+            <w:tcW w:type="dxa" w:w="3264"/>
+          </w:tcPr>
+          <w:p>
+            <w:pPr>
+              <w:spacing w:after="0"/>
+            </w:pPr>
+            <w:r>
+              <w:rPr>
+                <w:sz w:val="16"/>
+              </w:rPr>
+            </w:r>
+            <w:r>
+              <w:rPr>
+                <w:b/>
+                <w:sz w:val="16"/>
+              </w:rPr>
+              <w:t>新增测试集确认实验</w:t>
+            </w:r>
+            <w:r>
+              <w:rPr>
+                <w:sz w:val="16"/>
+              </w:rPr>
+              <w:t>：验证集选出的配置（三折、C=1.0、边距描述子）在锁定测试分区上评估，三个种子与默认配置</w:t>
+            </w:r>
+            <w:r>
+              <w:rPr>
+                <w:b/>
+                <w:sz w:val="16"/>
+              </w:rPr>
+              <w:t>逐条预测完全相同</w:t>
+            </w:r>
+            <w:r>
+              <w:rPr>
+                <w:sz w:val="16"/>
+              </w:rPr>
+              <w:t>（23 958 行改判 0 条，Macro-F1 六位小数一致）。同时说明最优点是并列而非唯一</w:t>
+            </w:r>
+          </w:p>
+        </w:tc>
+      </w:tr>
+      <w:tr>
+        <w:tc>
+          <w:tcPr>
+            <w:tcW w:type="dxa" w:w="3264"/>
+          </w:tcPr>
+          <w:p>
+            <w:pPr>
+              <w:spacing w:after="0"/>
+            </w:pPr>
+            <w:r>
+              <w:rPr>
+                <w:sz w:val="16"/>
+              </w:rPr>
+            </w:r>
+            <w:r>
+              <w:rPr>
+                <w:sz w:val="16"/>
+              </w:rPr>
+              <w:t>F3</w:t>
+            </w:r>
+          </w:p>
+        </w:tc>
+        <w:tc>
+          <w:tcPr>
+            <w:tcW w:type="dxa" w:w="3264"/>
+          </w:tcPr>
+          <w:p>
+            <w:pPr>
+              <w:spacing w:after="0"/>
+            </w:pPr>
+            <w:r>
+              <w:rPr>
+                <w:sz w:val="16"/>
+              </w:rPr>
+            </w:r>
+            <w:r>
+              <w:rPr>
+                <w:sz w:val="16"/>
+              </w:rPr>
+              <w:t>缩写首现未展开</w:t>
+            </w:r>
+          </w:p>
+        </w:tc>
+        <w:tc>
+          <w:tcPr>
+            <w:tcW w:type="dxa" w:w="3264"/>
+          </w:tcPr>
+          <w:p>
+            <w:pPr>
+              <w:spacing w:after="0"/>
+            </w:pPr>
+            <w:r>
+              <w:rPr>
+                <w:sz w:val="16"/>
+              </w:rPr>
+            </w:r>
+            <w:r>
+              <w:rPr>
+                <w:sz w:val="16"/>
+              </w:rPr>
+              <w:t>英文补 RF、MLP（§4.1）、MI、ANOVA（§2.2）、Mondrian（§3.4）、AUROC（§5.6）、CV（§6.3）；中文摘要补 risk-calibrated conformal forest 全称，§4.1 补 MLP</w:t>
+            </w:r>
+          </w:p>
+        </w:tc>
+      </w:tr>
+      <w:tr>
+        <w:tc>
+          <w:tcPr>
+            <w:tcW w:type="dxa" w:w="3264"/>
+          </w:tcPr>
+          <w:p>
+            <w:pPr>
+              <w:spacing w:after="0"/>
+            </w:pPr>
+            <w:r>
+              <w:rPr>
+                <w:sz w:val="16"/>
+              </w:rPr>
+            </w:r>
+            <w:r>
+              <w:rPr>
+                <w:sz w:val="16"/>
+              </w:rPr>
+              <w:t>F4</w:t>
+            </w:r>
+          </w:p>
+        </w:tc>
+        <w:tc>
+          <w:tcPr>
+            <w:tcW w:type="dxa" w:w="3264"/>
+          </w:tcPr>
+          <w:p>
+            <w:pPr>
+              <w:spacing w:after="0"/>
+            </w:pPr>
+            <w:r>
+              <w:rPr>
+                <w:sz w:val="16"/>
+              </w:rPr>
+            </w:r>
+            <w:r>
+              <w:rPr>
+                <w:sz w:val="16"/>
+              </w:rPr>
+              <w:t>Highlights 为旧版</w:t>
+            </w:r>
+          </w:p>
+        </w:tc>
+        <w:tc>
+          <w:tcPr>
+            <w:tcW w:type="dxa" w:w="3264"/>
+          </w:tcPr>
+          <w:p>
+            <w:pPr>
+              <w:spacing w:after="0"/>
+            </w:pPr>
+            <w:r>
+              <w:rPr>
+                <w:sz w:val="16"/>
+              </w:rPr>
+            </w:r>
+            <w:r>
+              <w:rPr>
+                <w:sz w:val="16"/>
+              </w:rPr>
+              <w:t xml:space="preserve">新写 </w:t>
+            </w:r>
+            <w:r>
+              <w:rPr>
+                <w:rFonts w:ascii="Consolas" w:hAnsi="Consolas"/>
+                <w:sz w:val="16"/>
+              </w:rPr>
+              <w:t>Highlights_v4.md</w:t>
+            </w:r>
+            <w:r>
+              <w:rPr>
+                <w:sz w:val="16"/>
+              </w:rPr>
+              <w:t>，5 条英文要点（最长 82 字符，符合 85 字符上限）与对应中文版</w:t>
+            </w:r>
+          </w:p>
+        </w:tc>
+      </w:tr>
+      <w:tr>
+        <w:tc>
+          <w:tcPr>
+            <w:tcW w:type="dxa" w:w="3264"/>
+          </w:tcPr>
+          <w:p>
+            <w:pPr>
+              <w:spacing w:after="0"/>
+            </w:pPr>
+            <w:r>
+              <w:rPr>
+                <w:sz w:val="16"/>
+              </w:rPr>
+            </w:r>
+            <w:r>
+              <w:rPr>
+                <w:sz w:val="16"/>
+              </w:rPr>
+              <w:t>F5</w:t>
+            </w:r>
+          </w:p>
+        </w:tc>
+        <w:tc>
+          <w:tcPr>
+            <w:tcW w:type="dxa" w:w="3264"/>
+          </w:tcPr>
+          <w:p>
+            <w:pPr>
+              <w:spacing w:after="0"/>
+            </w:pPr>
+            <w:r>
+              <w:rPr>
+                <w:sz w:val="16"/>
+              </w:rPr>
+            </w:r>
+            <w:r>
+              <w:rPr>
+                <w:sz w:val="16"/>
+              </w:rPr>
+              <w:t>Demsar 拼写不一致</w:t>
+            </w:r>
+          </w:p>
+        </w:tc>
+        <w:tc>
+          <w:tcPr>
+            <w:tcW w:type="dxa" w:w="3264"/>
+          </w:tcPr>
+          <w:p>
+            <w:pPr>
+              <w:spacing w:after="0"/>
+            </w:pPr>
+            <w:r>
+              <w:rPr>
+                <w:sz w:val="16"/>
+              </w:rPr>
+            </w:r>
+            <w:r>
+              <w:rPr>
+                <w:sz w:val="16"/>
+              </w:rPr>
+              <w:t xml:space="preserve">统一为 </w:t>
+            </w:r>
+            <w:r>
+              <w:rPr>
+                <w:rFonts w:ascii="Consolas" w:hAnsi="Consolas"/>
+                <w:sz w:val="16"/>
+              </w:rPr>
+              <w:t>Demsar J</w:t>
+            </w:r>
+          </w:p>
+        </w:tc>
+      </w:tr>
+      <w:tr>
+        <w:tc>
+          <w:tcPr>
+            <w:tcW w:type="dxa" w:w="3264"/>
+          </w:tcPr>
+          <w:p>
+            <w:pPr>
+              <w:spacing w:after="0"/>
+            </w:pPr>
+            <w:r>
+              <w:rPr>
+                <w:sz w:val="16"/>
+              </w:rPr>
+            </w:r>
+            <w:r>
+              <w:rPr>
+                <w:sz w:val="16"/>
+              </w:rPr>
+              <w:t>G2</w:t>
+            </w:r>
+          </w:p>
+        </w:tc>
+        <w:tc>
+          <w:tcPr>
+            <w:tcW w:type="dxa" w:w="3264"/>
+          </w:tcPr>
+          <w:p>
+            <w:pPr>
+              <w:spacing w:after="0"/>
+            </w:pPr>
+            <w:r>
+              <w:rPr>
+                <w:sz w:val="16"/>
+              </w:rPr>
+            </w:r>
+            <w:r>
+              <w:rPr>
+                <w:sz w:val="16"/>
+              </w:rPr>
+              <w:t>发布包含旧协议结果</w:t>
+            </w:r>
+          </w:p>
+        </w:tc>
+        <w:tc>
+          <w:tcPr>
+            <w:tcW w:type="dxa" w:w="3264"/>
+          </w:tcPr>
+          <w:p>
+            <w:pPr>
+              <w:spacing w:after="0"/>
+            </w:pPr>
+            <w:r>
+              <w:rPr>
+                <w:sz w:val="16"/>
+              </w:rPr>
+            </w:r>
+            <w:r>
+              <w:rPr>
+                <w:sz w:val="16"/>
+              </w:rPr>
+              <w:t xml:space="preserve">5 个旧鲁棒性文件移入 </w:t>
+            </w:r>
+            <w:r>
+              <w:rPr>
+                <w:rFonts w:ascii="Consolas" w:hAnsi="Consolas"/>
+                <w:sz w:val="16"/>
+              </w:rPr>
+              <w:t>superseded/</w:t>
+            </w:r>
+            <w:r>
+              <w:rPr>
+                <w:sz w:val="16"/>
+              </w:rPr>
+              <w:t xml:space="preserve">，附 </w:t>
+            </w:r>
+            <w:r>
+              <w:rPr>
+                <w:rFonts w:ascii="Consolas" w:hAnsi="Consolas"/>
+                <w:sz w:val="16"/>
+              </w:rPr>
+              <w:t>README.md</w:t>
+            </w:r>
+            <w:r>
+              <w:rPr>
+                <w:sz w:val="16"/>
+              </w:rPr>
+              <w:t xml:space="preserve"> 说明协议差异与不可混用</w:t>
+            </w:r>
+          </w:p>
+        </w:tc>
+      </w:tr>
+    </w:tbl>
+    <w:p>
+      <w:pPr>
+        <w:spacing w:after="40"/>
+      </w:pPr>
+    </w:p>
+    <w:p>
+      <w:pPr>
+        <w:pStyle w:val="Heading2"/>
+      </w:pPr>
+      <w:r>
+        <w:t>新增验证结果</w:t>
+      </w:r>
+    </w:p>
+    <w:p>
+      <w:pPr>
+        <w:pStyle w:val="ListBullet"/>
+      </w:pPr>
+      <w:r>
+        <w:rPr>
+          <w:rFonts w:ascii="Consolas" w:hAnsi="Consolas"/>
+        </w:rPr>
+        <w:t>audit_selective_reporting_v5.py</w:t>
+      </w:r>
+      <w:r>
+        <w:t>：扫描 108 张含双臂的结果表，条件加权相对等权的</w:t>
+      </w:r>
+      <w:r>
+        <w:rPr>
+          <w:b/>
+        </w:rPr>
+        <w:t>最大优势仅 +0.00198</w:t>
+      </w:r>
+      <w:r>
+        <w:t>，无选择性报告。</w:t>
+      </w:r>
+    </w:p>
+    <w:p>
+      <w:pPr>
+        <w:pStyle w:val="ListBullet"/>
+      </w:pPr>
+      <w:r>
+        <w:rPr>
+          <w:rFonts w:ascii="Consolas" w:hAnsi="Consolas"/>
+        </w:rPr>
+        <w:t>audit_number_traceability_v5.py</w:t>
+      </w:r>
+      <w:r>
+        <w:t>：</w:t>
+      </w:r>
+      <w:r>
+        <w:rPr>
+          <w:b/>
+        </w:rPr>
+        <w:t>50 项关键数字全部与源文件一致，零失配。</w:t>
+      </w:r>
+    </w:p>
+    <w:p>
+      <w:pPr>
+        <w:pStyle w:val="ListBullet"/>
+      </w:pPr>
+      <w:r>
+        <w:t>单元测试 118 项通过；v5 脚本全部编译通过。</w:t>
+      </w:r>
+    </w:p>
+    <w:p>
+      <w:pPr>
+        <w:pStyle w:val="Heading2"/>
+      </w:pPr>
+      <w:r>
+        <w:t>修复后仍待处理（需你决策或提供信息）</w:t>
+      </w:r>
+    </w:p>
+    <w:tbl>
+      <w:tblPr>
+        <w:tblStyle w:val="TableGrid"/>
+        <w:tblW w:type="auto" w:w="0"/>
+        <w:tblLook w:firstColumn="1" w:firstRow="1" w:lastColumn="0" w:lastRow="0" w:noHBand="0" w:noVBand="1" w:val="04A0"/>
+      </w:tblPr>
+      <w:tblGrid>
+        <w:gridCol w:w="3264"/>
+        <w:gridCol w:w="3264"/>
+        <w:gridCol w:w="3264"/>
+      </w:tblGrid>
+      <w:tr>
+        <w:tc>
+          <w:tcPr>
+            <w:tcW w:type="dxa" w:w="3264"/>
+          </w:tcPr>
+          <w:p>
+            <w:pPr>
+              <w:spacing w:after="0"/>
+            </w:pPr>
+            <w:r>
+              <w:rPr>
+                <w:sz w:val="16"/>
+              </w:rPr>
+            </w:r>
+            <w:r>
+              <w:rPr>
+                <w:b/>
+                <w:sz w:val="16"/>
+              </w:rPr>
+              <w:t>事项</w:t>
+            </w:r>
+          </w:p>
+        </w:tc>
+        <w:tc>
+          <w:tcPr>
+            <w:tcW w:type="dxa" w:w="3264"/>
+          </w:tcPr>
+          <w:p>
+            <w:pPr>
+              <w:spacing w:after="0"/>
+            </w:pPr>
+            <w:r>
+              <w:rPr>
+                <w:sz w:val="16"/>
+              </w:rPr>
+            </w:r>
+            <w:r>
+              <w:rPr>
+                <w:b/>
+                <w:sz w:val="16"/>
+              </w:rPr>
+              <w:t>类型</w:t>
+            </w:r>
+          </w:p>
+        </w:tc>
+        <w:tc>
+          <w:tcPr>
+            <w:tcW w:type="dxa" w:w="3264"/>
+          </w:tcPr>
+          <w:p>
+            <w:pPr>
+              <w:spacing w:after="0"/>
+            </w:pPr>
+            <w:r>
+              <w:rPr>
+                <w:sz w:val="16"/>
+              </w:rPr>
+            </w:r>
+            <w:r>
+              <w:rPr>
+                <w:b/>
+                <w:sz w:val="16"/>
+              </w:rPr>
+              <w:t>说明</w:t>
+            </w:r>
+          </w:p>
+        </w:tc>
+      </w:tr>
+      <w:tr>
+        <w:tc>
+          <w:tcPr>
+            <w:tcW w:type="dxa" w:w="3264"/>
+          </w:tcPr>
+          <w:p>
+            <w:pPr>
+              <w:spacing w:after="0"/>
+            </w:pPr>
+            <w:r>
+              <w:rPr>
+                <w:sz w:val="16"/>
+              </w:rPr>
+            </w:r>
+            <w:r>
+              <w:rPr>
+                <w:sz w:val="16"/>
+              </w:rPr>
+              <w:t>推送 v1.1.0 到 GitHub</w:t>
+            </w:r>
+          </w:p>
+        </w:tc>
+        <w:tc>
+          <w:tcPr>
+            <w:tcW w:type="dxa" w:w="3264"/>
+          </w:tcPr>
+          <w:p>
+            <w:pPr>
+              <w:spacing w:after="0"/>
+            </w:pPr>
+            <w:r>
+              <w:rPr>
+                <w:sz w:val="16"/>
+              </w:rPr>
+            </w:r>
+            <w:r>
+              <w:rPr>
+                <w:sz w:val="16"/>
+              </w:rPr>
+              <w:t>需批准</w:t>
+            </w:r>
+          </w:p>
+        </w:tc>
+        <w:tc>
+          <w:tcPr>
+            <w:tcW w:type="dxa" w:w="3264"/>
+          </w:tcPr>
+          <w:p>
+            <w:pPr>
+              <w:spacing w:after="0"/>
+            </w:pPr>
+            <w:r>
+              <w:rPr>
+                <w:sz w:val="16"/>
+              </w:rPr>
+            </w:r>
+            <w:r>
+              <w:rPr>
+                <w:sz w:val="16"/>
+              </w:rPr>
+              <w:t>完成后 D1 才算真正关闭</w:t>
+            </w:r>
+          </w:p>
+        </w:tc>
+      </w:tr>
+      <w:tr>
+        <w:tc>
+          <w:tcPr>
+            <w:tcW w:type="dxa" w:w="3264"/>
+          </w:tcPr>
+          <w:p>
+            <w:pPr>
+              <w:spacing w:after="0"/>
+            </w:pPr>
+            <w:r>
+              <w:rPr>
+                <w:sz w:val="16"/>
+              </w:rPr>
+            </w:r>
+            <w:r>
+              <w:rPr>
+                <w:sz w:val="16"/>
+              </w:rPr>
+              <w:t>作者信息（姓名/单位/通信作者/ORCID/基金）</w:t>
+            </w:r>
+          </w:p>
+        </w:tc>
+        <w:tc>
+          <w:tcPr>
+            <w:tcW w:type="dxa" w:w="3264"/>
+          </w:tcPr>
+          <w:p>
+            <w:pPr>
+              <w:spacing w:after="0"/>
+            </w:pPr>
+            <w:r>
+              <w:rPr>
+                <w:sz w:val="16"/>
+              </w:rPr>
+            </w:r>
+            <w:r>
+              <w:rPr>
+                <w:sz w:val="16"/>
+              </w:rPr>
+              <w:t>需提供</w:t>
+            </w:r>
+          </w:p>
+        </w:tc>
+        <w:tc>
+          <w:tcPr>
+            <w:tcW w:type="dxa" w:w="3264"/>
+          </w:tcPr>
+          <w:p>
+            <w:pPr>
+              <w:spacing w:after="0"/>
+            </w:pPr>
+            <w:r>
+              <w:rPr>
+                <w:sz w:val="16"/>
+              </w:rPr>
+            </w:r>
+            <w:r>
+              <w:rPr>
+                <w:sz w:val="16"/>
+              </w:rPr>
+              <w:t>两版各 3 处占位符</w:t>
+            </w:r>
+          </w:p>
+        </w:tc>
+      </w:tr>
+      <w:tr>
+        <w:tc>
+          <w:tcPr>
+            <w:tcW w:type="dxa" w:w="3264"/>
+          </w:tcPr>
+          <w:p>
+            <w:pPr>
+              <w:spacing w:after="0"/>
+            </w:pPr>
+            <w:r>
+              <w:rPr>
+                <w:sz w:val="16"/>
+              </w:rPr>
+            </w:r>
+            <w:r>
+              <w:rPr>
+                <w:sz w:val="16"/>
+              </w:rPr>
+              <w:t>参考文献 DOI 逐条核验</w:t>
+            </w:r>
+          </w:p>
+        </w:tc>
+        <w:tc>
+          <w:tcPr>
+            <w:tcW w:type="dxa" w:w="3264"/>
+          </w:tcPr>
+          <w:p>
+            <w:pPr>
+              <w:spacing w:after="0"/>
+            </w:pPr>
+            <w:r>
+              <w:rPr>
+                <w:sz w:val="16"/>
+              </w:rPr>
+            </w:r>
+            <w:r>
+              <w:rPr>
+                <w:sz w:val="16"/>
+              </w:rPr>
+              <w:t>我可执行</w:t>
+            </w:r>
+          </w:p>
+        </w:tc>
+        <w:tc>
+          <w:tcPr>
+            <w:tcW w:type="dxa" w:w="3264"/>
+          </w:tcPr>
+          <w:p>
+            <w:pPr>
+              <w:spacing w:after="0"/>
+            </w:pPr>
+            <w:r>
+              <w:rPr>
+                <w:sz w:val="16"/>
+              </w:rPr>
+            </w:r>
+            <w:r>
+              <w:rPr>
+                <w:sz w:val="16"/>
+              </w:rPr>
+              <w:t>两版各 13 条待核验</w:t>
+            </w:r>
+          </w:p>
+        </w:tc>
+      </w:tr>
+      <w:tr>
+        <w:tc>
+          <w:tcPr>
+            <w:tcW w:type="dxa" w:w="3264"/>
+          </w:tcPr>
+          <w:p>
+            <w:pPr>
+              <w:spacing w:after="0"/>
+            </w:pPr>
+            <w:r>
+              <w:rPr>
+                <w:sz w:val="16"/>
+              </w:rPr>
+            </w:r>
+            <w:r>
+              <w:rPr>
+                <w:sz w:val="16"/>
+              </w:rPr>
+              <w:t>按目标期刊模板排版</w:t>
+            </w:r>
+          </w:p>
+        </w:tc>
+        <w:tc>
+          <w:tcPr>
+            <w:tcW w:type="dxa" w:w="3264"/>
+          </w:tcPr>
+          <w:p>
+            <w:pPr>
+              <w:spacing w:after="0"/>
+            </w:pPr>
+            <w:r>
+              <w:rPr>
+                <w:sz w:val="16"/>
+              </w:rPr>
+            </w:r>
+            <w:r>
+              <w:rPr>
+                <w:sz w:val="16"/>
+              </w:rPr>
+              <w:t>我可执行</w:t>
+            </w:r>
+          </w:p>
+        </w:tc>
+        <w:tc>
+          <w:tcPr>
+            <w:tcW w:type="dxa" w:w="3264"/>
+          </w:tcPr>
+          <w:p>
+            <w:pPr>
+              <w:spacing w:after="0"/>
+            </w:pPr>
+            <w:r>
+              <w:rPr>
+                <w:sz w:val="16"/>
+              </w:rPr>
+            </w:r>
+            <w:r>
+              <w:rPr>
+                <w:sz w:val="16"/>
+              </w:rPr>
+              <w:t>需先确认期刊</w:t>
+            </w:r>
+          </w:p>
+        </w:tc>
+      </w:tr>
+      <w:tr>
+        <w:tc>
+          <w:tcPr>
+            <w:tcW w:type="dxa" w:w="3264"/>
+          </w:tcPr>
+          <w:p>
+            <w:pPr>
+              <w:spacing w:after="0"/>
+            </w:pPr>
+            <w:r>
+              <w:rPr>
+                <w:sz w:val="16"/>
+              </w:rPr>
+            </w:r>
+            <w:r>
+              <w:rPr>
+                <w:sz w:val="16"/>
+              </w:rPr>
+              <w:t>P1 实验（时间协议、全语料、代价敏感等）</w:t>
+            </w:r>
+          </w:p>
+        </w:tc>
+        <w:tc>
+          <w:tcPr>
+            <w:tcW w:type="dxa" w:w="3264"/>
+          </w:tcPr>
+          <w:p>
+            <w:pPr>
+              <w:spacing w:after="0"/>
+            </w:pPr>
+            <w:r>
+              <w:rPr>
+                <w:sz w:val="16"/>
+              </w:rPr>
+            </w:r>
+            <w:r>
+              <w:rPr>
+                <w:sz w:val="16"/>
+              </w:rPr>
+              <w:t>我可执行</w:t>
+            </w:r>
+          </w:p>
+        </w:tc>
+        <w:tc>
+          <w:tcPr>
+            <w:tcW w:type="dxa" w:w="3264"/>
+          </w:tcPr>
+          <w:p>
+            <w:pPr>
+              <w:spacing w:after="0"/>
+            </w:pPr>
+            <w:r>
+              <w:rPr>
+                <w:sz w:val="16"/>
+              </w:rPr>
+            </w:r>
+            <w:r>
+              <w:rPr>
+                <w:sz w:val="16"/>
+              </w:rPr>
+              <w:t>非阻塞，决定论文档次</w:t>
+            </w:r>
+          </w:p>
+        </w:tc>
+      </w:tr>
+    </w:tbl>
+    <w:p>
+      <w:pPr>
+        <w:spacing w:after="40"/>
+      </w:pPr>
     </w:p>
     <w:sectPr>
       <w:pgSz w:w="12240" w:h="15840"/>

</xml_diff>

<commit_message>
Add a single verification gate and complete the eighth review round
- scripts/verify_all_v8.py runs every audit as a subprocess and exits non-zero on any
  failure, so a silently failing script can no longer slip through unnoticed
- The gate includes a release-tag check after the v1.7.0 mismatch
- Fault-injection test performed: an injected wrong version was caught (exit 1) and the
  restored manuscript passed
- Two false-positive markers in the gate itself were corrected
- Review report extended with round eight
- Enumeration audit found no remaining inconsistencies between declared and actual counts
</commit_message>
<xml_diff>
--- a/重构版论文_v4_20260915/遗漏问题审查报告.docx
+++ b/重构版论文_v4_20260915/遗漏问题审查报告.docx
@@ -10386,6 +10386,592 @@
       </w:r>
       <w:r>
         <w:t>。剩余 4 项部分通过全部属于作者信息（署名/CRediT、基金/利益冲突）、母语润色与官方模板排版，即用户明确要求暂不处理的范围。</w:t>
+      </w:r>
+    </w:p>
+    <w:p>
+      <w:pPr>
+        <w:pStyle w:val="Heading1"/>
+      </w:pPr>
+      <w:r>
+        <w:t>N. 第八轮审查（2026-09-17）：验证闸门与自检</w:t>
+      </w:r>
+    </w:p>
+    <w:p>
+      <w:r>
+        <w:t>第七轮暴露出一个流程缺陷：版本升级脚本因缩进错误静默失败，但提交与打标签照常执行，导致稿件引用的版本与仓库标签不一致。这一轮针对</w:t>
+      </w:r>
+      <w:r>
+        <w:rPr>
+          <w:b/>
+        </w:rPr>
+        <w:t>检查流程本身</w:t>
+      </w:r>
+      <w:r>
+        <w:t>做了修补。</w:t>
+      </w:r>
+    </w:p>
+    <w:p>
+      <w:pPr>
+        <w:pStyle w:val="Heading2"/>
+      </w:pPr>
+      <w:r>
+        <w:t>新增：单一验证闸门 `scripts/verify_all_v8.py`</w:t>
+      </w:r>
+    </w:p>
+    <w:p>
+      <w:r>
+        <w:t>把此前分散的检查串成一道命令，任一项失败即以非零退出码报错：</w:t>
+      </w:r>
+    </w:p>
+    <w:tbl>
+      <w:tblPr>
+        <w:tblStyle w:val="TableGrid"/>
+        <w:tblW w:type="auto" w:w="0"/>
+        <w:tblLook w:firstColumn="1" w:firstRow="1" w:lastColumn="0" w:lastRow="0" w:noHBand="0" w:noVBand="1" w:val="04A0"/>
+      </w:tblPr>
+      <w:tblGrid>
+        <w:gridCol w:w="4896"/>
+        <w:gridCol w:w="4896"/>
+      </w:tblGrid>
+      <w:tr>
+        <w:tc>
+          <w:tcPr>
+            <w:tcW w:type="dxa" w:w="4896"/>
+          </w:tcPr>
+          <w:p>
+            <w:pPr>
+              <w:spacing w:after="0"/>
+            </w:pPr>
+            <w:r>
+              <w:rPr>
+                <w:sz w:val="16"/>
+              </w:rPr>
+            </w:r>
+            <w:r>
+              <w:rPr>
+                <w:b/>
+                <w:sz w:val="16"/>
+              </w:rPr>
+              <w:t>检查项</w:t>
+            </w:r>
+          </w:p>
+        </w:tc>
+        <w:tc>
+          <w:tcPr>
+            <w:tcW w:type="dxa" w:w="4896"/>
+          </w:tcPr>
+          <w:p>
+            <w:pPr>
+              <w:spacing w:after="0"/>
+            </w:pPr>
+            <w:r>
+              <w:rPr>
+                <w:sz w:val="16"/>
+              </w:rPr>
+            </w:r>
+            <w:r>
+              <w:rPr>
+                <w:b/>
+                <w:sz w:val="16"/>
+              </w:rPr>
+              <w:t>覆盖内容</w:t>
+            </w:r>
+          </w:p>
+        </w:tc>
+      </w:tr>
+      <w:tr>
+        <w:tc>
+          <w:tcPr>
+            <w:tcW w:type="dxa" w:w="4896"/>
+          </w:tcPr>
+          <w:p>
+            <w:pPr>
+              <w:spacing w:after="0"/>
+            </w:pPr>
+            <w:r>
+              <w:rPr>
+                <w:sz w:val="16"/>
+              </w:rPr>
+            </w:r>
+            <w:r>
+              <w:rPr>
+                <w:sz w:val="16"/>
+              </w:rPr>
+              <w:t>unit tests</w:t>
+            </w:r>
+          </w:p>
+        </w:tc>
+        <w:tc>
+          <w:tcPr>
+            <w:tcW w:type="dxa" w:w="4896"/>
+          </w:tcPr>
+          <w:p>
+            <w:pPr>
+              <w:spacing w:after="0"/>
+            </w:pPr>
+            <w:r>
+              <w:rPr>
+                <w:sz w:val="16"/>
+              </w:rPr>
+            </w:r>
+            <w:r>
+              <w:rPr>
+                <w:sz w:val="16"/>
+              </w:rPr>
+              <w:t>118 项单元测试</w:t>
+            </w:r>
+          </w:p>
+        </w:tc>
+      </w:tr>
+      <w:tr>
+        <w:tc>
+          <w:tcPr>
+            <w:tcW w:type="dxa" w:w="4896"/>
+          </w:tcPr>
+          <w:p>
+            <w:pPr>
+              <w:spacing w:after="0"/>
+            </w:pPr>
+            <w:r>
+              <w:rPr>
+                <w:sz w:val="16"/>
+              </w:rPr>
+            </w:r>
+            <w:r>
+              <w:rPr>
+                <w:sz w:val="16"/>
+              </w:rPr>
+              <w:t>compile all sources</w:t>
+            </w:r>
+          </w:p>
+        </w:tc>
+        <w:tc>
+          <w:tcPr>
+            <w:tcW w:type="dxa" w:w="4896"/>
+          </w:tcPr>
+          <w:p>
+            <w:pPr>
+              <w:spacing w:after="0"/>
+            </w:pPr>
+            <w:r>
+              <w:rPr>
+                <w:sz w:val="16"/>
+              </w:rPr>
+            </w:r>
+            <w:r>
+              <w:rPr>
+                <w:sz w:val="16"/>
+              </w:rPr>
+              <w:t>src / scripts / tests 全量编译</w:t>
+            </w:r>
+          </w:p>
+        </w:tc>
+      </w:tr>
+      <w:tr>
+        <w:tc>
+          <w:tcPr>
+            <w:tcW w:type="dxa" w:w="4896"/>
+          </w:tcPr>
+          <w:p>
+            <w:pPr>
+              <w:spacing w:after="0"/>
+            </w:pPr>
+            <w:r>
+              <w:rPr>
+                <w:sz w:val="16"/>
+              </w:rPr>
+            </w:r>
+            <w:r>
+              <w:rPr>
+                <w:sz w:val="16"/>
+              </w:rPr>
+              <w:t>manuscript structure</w:t>
+            </w:r>
+          </w:p>
+        </w:tc>
+        <w:tc>
+          <w:tcPr>
+            <w:tcW w:type="dxa" w:w="4896"/>
+          </w:tcPr>
+          <w:p>
+            <w:pPr>
+              <w:spacing w:after="0"/>
+            </w:pPr>
+            <w:r>
+              <w:rPr>
+                <w:sz w:val="16"/>
+              </w:rPr>
+            </w:r>
+            <w:r>
+              <w:rPr>
+                <w:sz w:val="16"/>
+              </w:rPr>
+              <w:t>图表编号连续性、图片文件存在性、DOI 占位符</w:t>
+            </w:r>
+          </w:p>
+        </w:tc>
+      </w:tr>
+      <w:tr>
+        <w:tc>
+          <w:tcPr>
+            <w:tcW w:type="dxa" w:w="4896"/>
+          </w:tcPr>
+          <w:p>
+            <w:pPr>
+              <w:spacing w:after="0"/>
+            </w:pPr>
+            <w:r>
+              <w:rPr>
+                <w:sz w:val="16"/>
+              </w:rPr>
+            </w:r>
+            <w:r>
+              <w:rPr>
+                <w:sz w:val="16"/>
+              </w:rPr>
+              <w:t>citation coverage</w:t>
+            </w:r>
+          </w:p>
+        </w:tc>
+        <w:tc>
+          <w:tcPr>
+            <w:tcW w:type="dxa" w:w="4896"/>
+          </w:tcPr>
+          <w:p>
+            <w:pPr>
+              <w:spacing w:after="0"/>
+            </w:pPr>
+            <w:r>
+              <w:rPr>
+                <w:sz w:val="16"/>
+              </w:rPr>
+            </w:r>
+            <w:r>
+              <w:rPr>
+                <w:sz w:val="16"/>
+              </w:rPr>
+              <w:t>45 条文献的文内覆盖率</w:t>
+            </w:r>
+          </w:p>
+        </w:tc>
+      </w:tr>
+      <w:tr>
+        <w:tc>
+          <w:tcPr>
+            <w:tcW w:type="dxa" w:w="4896"/>
+          </w:tcPr>
+          <w:p>
+            <w:pPr>
+              <w:spacing w:after="0"/>
+            </w:pPr>
+            <w:r>
+              <w:rPr>
+                <w:sz w:val="16"/>
+              </w:rPr>
+            </w:r>
+            <w:r>
+              <w:rPr>
+                <w:sz w:val="16"/>
+              </w:rPr>
+              <w:t>number traceability</w:t>
+            </w:r>
+          </w:p>
+        </w:tc>
+        <w:tc>
+          <w:tcPr>
+            <w:tcW w:type="dxa" w:w="4896"/>
+          </w:tcPr>
+          <w:p>
+            <w:pPr>
+              <w:spacing w:after="0"/>
+            </w:pPr>
+            <w:r>
+              <w:rPr>
+                <w:sz w:val="16"/>
+              </w:rPr>
+            </w:r>
+            <w:r>
+              <w:rPr>
+                <w:sz w:val="16"/>
+              </w:rPr>
+              <w:t>63 项关键数字与源文件比对</w:t>
+            </w:r>
+          </w:p>
+        </w:tc>
+      </w:tr>
+      <w:tr>
+        <w:tc>
+          <w:tcPr>
+            <w:tcW w:type="dxa" w:w="4896"/>
+          </w:tcPr>
+          <w:p>
+            <w:pPr>
+              <w:spacing w:after="0"/>
+            </w:pPr>
+            <w:r>
+              <w:rPr>
+                <w:sz w:val="16"/>
+              </w:rPr>
+            </w:r>
+            <w:r>
+              <w:rPr>
+                <w:sz w:val="16"/>
+              </w:rPr>
+              <w:t>reference annotations</w:t>
+            </w:r>
+          </w:p>
+        </w:tc>
+        <w:tc>
+          <w:tcPr>
+            <w:tcW w:type="dxa" w:w="4896"/>
+          </w:tcPr>
+          <w:p>
+            <w:pPr>
+              <w:spacing w:after="0"/>
+            </w:pPr>
+            <w:r>
+              <w:rPr>
+                <w:sz w:val="16"/>
+              </w:rPr>
+            </w:r>
+            <w:r>
+              <w:rPr>
+                <w:sz w:val="16"/>
+              </w:rPr>
+              <w:t>无 DOI 标注的出版方一致性</w:t>
+            </w:r>
+          </w:p>
+        </w:tc>
+      </w:tr>
+      <w:tr>
+        <w:tc>
+          <w:tcPr>
+            <w:tcW w:type="dxa" w:w="4896"/>
+          </w:tcPr>
+          <w:p>
+            <w:pPr>
+              <w:spacing w:after="0"/>
+            </w:pPr>
+            <w:r>
+              <w:rPr>
+                <w:sz w:val="16"/>
+              </w:rPr>
+            </w:r>
+            <w:r>
+              <w:rPr>
+                <w:sz w:val="16"/>
+              </w:rPr>
+              <w:t>cross-document audit</w:t>
+            </w:r>
+          </w:p>
+        </w:tc>
+        <w:tc>
+          <w:tcPr>
+            <w:tcW w:type="dxa" w:w="4896"/>
+          </w:tcPr>
+          <w:p>
+            <w:pPr>
+              <w:spacing w:after="0"/>
+            </w:pPr>
+            <w:r>
+              <w:rPr>
+                <w:sz w:val="16"/>
+              </w:rPr>
+            </w:r>
+            <w:r>
+              <w:rPr>
+                <w:sz w:val="16"/>
+              </w:rPr>
+              <w:t>新加内容、补充材料清单、Highlights、自查表内部一致性</w:t>
+            </w:r>
+          </w:p>
+        </w:tc>
+      </w:tr>
+      <w:tr>
+        <w:tc>
+          <w:tcPr>
+            <w:tcW w:type="dxa" w:w="4896"/>
+          </w:tcPr>
+          <w:p>
+            <w:pPr>
+              <w:spacing w:after="0"/>
+            </w:pPr>
+            <w:r>
+              <w:rPr>
+                <w:sz w:val="16"/>
+              </w:rPr>
+            </w:r>
+            <w:r>
+              <w:rPr>
+                <w:sz w:val="16"/>
+              </w:rPr>
+              <w:t>language consistency</w:t>
+            </w:r>
+          </w:p>
+        </w:tc>
+        <w:tc>
+          <w:tcPr>
+            <w:tcW w:type="dxa" w:w="4896"/>
+          </w:tcPr>
+          <w:p>
+            <w:pPr>
+              <w:spacing w:after="0"/>
+            </w:pPr>
+            <w:r>
+              <w:rPr>
+                <w:sz w:val="16"/>
+              </w:rPr>
+            </w:r>
+            <w:r>
+              <w:rPr>
+                <w:sz w:val="16"/>
+              </w:rPr>
+              <w:t>拼写体系混用检测</w:t>
+            </w:r>
+          </w:p>
+        </w:tc>
+      </w:tr>
+      <w:tr>
+        <w:tc>
+          <w:tcPr>
+            <w:tcW w:type="dxa" w:w="4896"/>
+          </w:tcPr>
+          <w:p>
+            <w:pPr>
+              <w:spacing w:after="0"/>
+            </w:pPr>
+            <w:r>
+              <w:rPr>
+                <w:sz w:val="16"/>
+              </w:rPr>
+            </w:r>
+            <w:r>
+              <w:rPr>
+                <w:sz w:val="16"/>
+              </w:rPr>
+              <w:t>release tag</w:t>
+            </w:r>
+          </w:p>
+        </w:tc>
+        <w:tc>
+          <w:tcPr>
+            <w:tcW w:type="dxa" w:w="4896"/>
+          </w:tcPr>
+          <w:p>
+            <w:pPr>
+              <w:spacing w:after="0"/>
+            </w:pPr>
+            <w:r>
+              <w:rPr>
+                <w:sz w:val="16"/>
+              </w:rPr>
+            </w:r>
+            <w:r>
+              <w:rPr>
+                <w:b/>
+                <w:sz w:val="16"/>
+              </w:rPr>
+              <w:t>稿件引用的版本号与最新 git 标签是否一致（本轮新增）</w:t>
+            </w:r>
+          </w:p>
+        </w:tc>
+      </w:tr>
+    </w:tbl>
+    <w:p>
+      <w:pPr>
+        <w:spacing w:after="40"/>
+      </w:pPr>
+    </w:p>
+    <w:p>
+      <w:pPr>
+        <w:pStyle w:val="Heading2"/>
+      </w:pPr>
+      <w:r>
+        <w:t>闸门的故障注入自检</w:t>
+      </w:r>
+    </w:p>
+    <w:p>
+      <w:r>
+        <w:t xml:space="preserve">为避免"验证器本身不验证"，对闸门做了一次故障注入：把英文稿中的 </w:t>
+      </w:r>
+      <w:r>
+        <w:rPr>
+          <w:rFonts w:ascii="Consolas" w:hAnsi="Consolas"/>
+        </w:rPr>
+        <w:t>v1.7.0</w:t>
+      </w:r>
+      <w:r>
+        <w:t xml:space="preserve"> 临时改为 </w:t>
+      </w:r>
+      <w:r>
+        <w:rPr>
+          <w:rFonts w:ascii="Consolas" w:hAnsi="Consolas"/>
+        </w:rPr>
+        <w:t>v1.4.0</w:t>
+      </w:r>
+      <w:r>
+        <w:t>，闸门立即报出两项失败（cross-document audit、release tag）并以退出码 1 结束；恢复后重新通过。</w:t>
+      </w:r>
+      <w:r>
+        <w:rPr>
+          <w:b/>
+        </w:rPr>
+        <w:t>验证器已验证有效。</w:t>
+      </w:r>
+    </w:p>
+    <w:p>
+      <w:pPr>
+        <w:pStyle w:val="Heading2"/>
+      </w:pPr>
+      <w:r>
+        <w:t>本轮同时修正的两处闸门误报</w:t>
+      </w:r>
+    </w:p>
+    <w:p>
+      <w:pPr>
+        <w:pStyle w:val="ListBullet"/>
+      </w:pPr>
+      <w:r>
+        <w:t>结构检查的失败标记字符串过短，会匹配到通过输出，已改为精确匹配。</w:t>
+      </w:r>
+    </w:p>
+    <w:p>
+      <w:pPr>
+        <w:pStyle w:val="ListBullet"/>
+      </w:pPr>
+      <w:r>
+        <w:t>参考文献标注检查未接受 JSTOR 稳定标识作为 1979 年 Scandinavian Journal of Statistics 条目的正确句柄，已加入该例外。</w:t>
+      </w:r>
+    </w:p>
+    <w:p>
+      <w:pPr>
+        <w:pStyle w:val="Heading2"/>
+      </w:pPr>
+      <w:r>
+        <w:t>本轮未发现新的论文内容问题</w:t>
+      </w:r>
+    </w:p>
+    <w:p>
+      <w:r>
+        <w:t>对全部枚举式表述做了分区计数核对：英文 §5.2 五项读数、§5.3 六组测量、§6.1 三个条件、§7 三条结论，以及四项贡献、八条报告建议、五组对照，</w:t>
+      </w:r>
+      <w:r>
+        <w:rPr>
+          <w:b/>
+        </w:rPr>
+        <w:t>声明数量与实际条目全部一致</w:t>
+      </w:r>
+      <w:r>
+        <w:t>。中文稿使用"第一，</w:t>
+      </w:r>
+      <w:r>
+        <w:rPr>
+          <w:b/>
+        </w:rPr>
+        <w:t>…</w:t>
+      </w:r>
+      <w:r>
+        <w:t>"格式（序数在加粗之外），属中英排版差异，非错误。</w:t>
       </w:r>
     </w:p>
     <w:sectPr>

</xml_diff>

<commit_message>
Round 11: record the supporting-document reconciliation
</commit_message>
<xml_diff>
--- a/重构版论文_v4_20260915/遗漏问题审查报告.docx
+++ b/重构版论文_v4_20260915/遗漏问题审查报告.docx
@@ -12627,6 +12627,801 @@
       </w:r>
       <w:r>
         <w:t>。这样，以后任何单侧修改数值都会在提交前被拦下。</w:t>
+      </w:r>
+    </w:p>
+    <w:p>
+      <w:pPr>
+        <w:pStyle w:val="Heading1"/>
+      </w:pPr>
+      <w:r>
+        <w:t>Q. 第十一轮审查（2026-09-17）：辅助文档与产物的对账</w:t>
+      </w:r>
+    </w:p>
+    <w:p>
+      <w:r>
+        <w:t>前十轮都在查稿件本身。这一轮换了对象：</w:t>
+      </w:r>
+      <w:r>
+        <w:rPr>
+          <w:b/>
+        </w:rPr>
+        <w:t>查那些用来证明稿件可信的辅助文档</w:t>
+      </w:r>
+      <w:r>
+        <w:t>——自查表、补充材料目录、审查报告自身。理由很直接：稿件被反复审读，辅助文档却没有；而导师和审稿人正是先看这些文件。</w:t>
+      </w:r>
+    </w:p>
+    <w:p>
+      <w:pPr>
+        <w:pStyle w:val="Heading2"/>
+      </w:pPr>
+      <w:r>
+        <w:t>方法</w:t>
+      </w:r>
+    </w:p>
+    <w:p>
+      <w:r>
+        <w:t>不再逐句读，而是把辅助文档中的每一处</w:t>
+      </w:r>
+      <w:r>
+        <w:rPr>
+          <w:b/>
+        </w:rPr>
+        <w:t>可核验陈述</w:t>
+      </w:r>
+      <w:r>
+        <w:t>（数字、路径、版本号、计数）与磁盘上的实际产物逐一对照，并把这些对照写成脚本，避免下次再漂移。</w:t>
+      </w:r>
+    </w:p>
+    <w:p>
+      <w:pPr>
+        <w:pStyle w:val="Heading2"/>
+      </w:pPr>
+      <w:r>
+        <w:t>发现的缺陷</w:t>
+      </w:r>
+    </w:p>
+    <w:tbl>
+      <w:tblPr>
+        <w:tblStyle w:val="TableGrid"/>
+        <w:tblW w:type="auto" w:w="0"/>
+        <w:tblLook w:firstColumn="1" w:firstRow="1" w:lastColumn="0" w:lastRow="0" w:noHBand="0" w:noVBand="1" w:val="04A0"/>
+      </w:tblPr>
+      <w:tblGrid>
+        <w:gridCol w:w="2448"/>
+        <w:gridCol w:w="2448"/>
+        <w:gridCol w:w="2448"/>
+        <w:gridCol w:w="2448"/>
+      </w:tblGrid>
+      <w:tr>
+        <w:tc>
+          <w:tcPr>
+            <w:tcW w:type="dxa" w:w="2448"/>
+          </w:tcPr>
+          <w:p>
+            <w:pPr>
+              <w:spacing w:after="0"/>
+            </w:pPr>
+            <w:r>
+              <w:rPr>
+                <w:sz w:val="16"/>
+              </w:rPr>
+            </w:r>
+            <w:r>
+              <w:rPr>
+                <w:b/>
+                <w:sz w:val="16"/>
+              </w:rPr>
+              <w:t>位置</w:t>
+            </w:r>
+          </w:p>
+        </w:tc>
+        <w:tc>
+          <w:tcPr>
+            <w:tcW w:type="dxa" w:w="2448"/>
+          </w:tcPr>
+          <w:p>
+            <w:pPr>
+              <w:spacing w:after="0"/>
+            </w:pPr>
+            <w:r>
+              <w:rPr>
+                <w:sz w:val="16"/>
+              </w:rPr>
+            </w:r>
+            <w:r>
+              <w:rPr>
+                <w:b/>
+                <w:sz w:val="16"/>
+              </w:rPr>
+              <w:t>文档中的陈述</w:t>
+            </w:r>
+          </w:p>
+        </w:tc>
+        <w:tc>
+          <w:tcPr>
+            <w:tcW w:type="dxa" w:w="2448"/>
+          </w:tcPr>
+          <w:p>
+            <w:pPr>
+              <w:spacing w:after="0"/>
+            </w:pPr>
+            <w:r>
+              <w:rPr>
+                <w:sz w:val="16"/>
+              </w:rPr>
+            </w:r>
+            <w:r>
+              <w:rPr>
+                <w:b/>
+                <w:sz w:val="16"/>
+              </w:rPr>
+              <w:t>实际产物</w:t>
+            </w:r>
+          </w:p>
+        </w:tc>
+        <w:tc>
+          <w:tcPr>
+            <w:tcW w:type="dxa" w:w="2448"/>
+          </w:tcPr>
+          <w:p>
+            <w:pPr>
+              <w:spacing w:after="0"/>
+            </w:pPr>
+            <w:r>
+              <w:rPr>
+                <w:sz w:val="16"/>
+              </w:rPr>
+            </w:r>
+            <w:r>
+              <w:rPr>
+                <w:b/>
+                <w:sz w:val="16"/>
+              </w:rPr>
+              <w:t>性质</w:t>
+            </w:r>
+          </w:p>
+        </w:tc>
+      </w:tr>
+      <w:tr>
+        <w:tc>
+          <w:tcPr>
+            <w:tcW w:type="dxa" w:w="2448"/>
+          </w:tcPr>
+          <w:p>
+            <w:pPr>
+              <w:spacing w:after="0"/>
+            </w:pPr>
+            <w:r>
+              <w:rPr>
+                <w:sz w:val="16"/>
+              </w:rPr>
+            </w:r>
+            <w:r>
+              <w:rPr>
+                <w:sz w:val="16"/>
+              </w:rPr>
+              <w:t>自查表 A4 / F1</w:t>
+            </w:r>
+          </w:p>
+        </w:tc>
+        <w:tc>
+          <w:tcPr>
+            <w:tcW w:type="dxa" w:w="2448"/>
+          </w:tcPr>
+          <w:p>
+            <w:pPr>
+              <w:spacing w:after="0"/>
+            </w:pPr>
+            <w:r>
+              <w:rPr>
+                <w:sz w:val="16"/>
+              </w:rPr>
+            </w:r>
+            <w:r>
+              <w:rPr>
+                <w:sz w:val="16"/>
+              </w:rPr>
+              <w:t xml:space="preserve">「已推送 </w:t>
+            </w:r>
+            <w:r>
+              <w:rPr>
+                <w:rFonts w:ascii="Consolas" w:hAnsi="Consolas"/>
+                <w:sz w:val="16"/>
+              </w:rPr>
+              <w:t>ebb0247</w:t>
+            </w:r>
+            <w:r>
+              <w:rPr>
+                <w:sz w:val="16"/>
+              </w:rPr>
+              <w:t xml:space="preserve">，标签 </w:t>
+            </w:r>
+            <w:r>
+              <w:rPr>
+                <w:rFonts w:ascii="Consolas" w:hAnsi="Consolas"/>
+                <w:sz w:val="16"/>
+              </w:rPr>
+              <w:t>v1.1.0</w:t>
+            </w:r>
+            <w:r>
+              <w:rPr>
+                <w:sz w:val="16"/>
+              </w:rPr>
+              <w:t>」</w:t>
+            </w:r>
+          </w:p>
+        </w:tc>
+        <w:tc>
+          <w:tcPr>
+            <w:tcW w:type="dxa" w:w="2448"/>
+          </w:tcPr>
+          <w:p>
+            <w:pPr>
+              <w:spacing w:after="0"/>
+            </w:pPr>
+            <w:r>
+              <w:rPr>
+                <w:sz w:val="16"/>
+              </w:rPr>
+            </w:r>
+            <w:r>
+              <w:rPr>
+                <w:sz w:val="16"/>
+              </w:rPr>
+              <w:t xml:space="preserve">发布标签已推进到 </w:t>
+            </w:r>
+            <w:r>
+              <w:rPr>
+                <w:rFonts w:ascii="Consolas" w:hAnsi="Consolas"/>
+                <w:sz w:val="16"/>
+              </w:rPr>
+              <w:t>v1.9.0</w:t>
+            </w:r>
+            <w:r>
+              <w:rPr>
+                <w:sz w:val="16"/>
+              </w:rPr>
+              <w:t xml:space="preserve">，本轮为 </w:t>
+            </w:r>
+            <w:r>
+              <w:rPr>
+                <w:rFonts w:ascii="Consolas" w:hAnsi="Consolas"/>
+                <w:sz w:val="16"/>
+              </w:rPr>
+              <w:t>v1.10.0</w:t>
+            </w:r>
+          </w:p>
+        </w:tc>
+        <w:tc>
+          <w:tcPr>
+            <w:tcW w:type="dxa" w:w="2448"/>
+          </w:tcPr>
+          <w:p>
+            <w:pPr>
+              <w:spacing w:after="0"/>
+            </w:pPr>
+            <w:r>
+              <w:rPr>
+                <w:sz w:val="16"/>
+              </w:rPr>
+            </w:r>
+            <w:r>
+              <w:rPr>
+                <w:sz w:val="16"/>
+              </w:rPr>
+              <w:t>陈旧事实：把过期的提交号与标签写成了当前状态</w:t>
+            </w:r>
+          </w:p>
+        </w:tc>
+      </w:tr>
+      <w:tr>
+        <w:tc>
+          <w:tcPr>
+            <w:tcW w:type="dxa" w:w="2448"/>
+          </w:tcPr>
+          <w:p>
+            <w:pPr>
+              <w:spacing w:after="0"/>
+            </w:pPr>
+            <w:r>
+              <w:rPr>
+                <w:sz w:val="16"/>
+              </w:rPr>
+            </w:r>
+            <w:r>
+              <w:rPr>
+                <w:sz w:val="16"/>
+              </w:rPr>
+              <w:t>自查表 E7</w:t>
+            </w:r>
+          </w:p>
+        </w:tc>
+        <w:tc>
+          <w:tcPr>
+            <w:tcW w:type="dxa" w:w="2448"/>
+          </w:tcPr>
+          <w:p>
+            <w:pPr>
+              <w:spacing w:after="0"/>
+            </w:pPr>
+            <w:r>
+              <w:rPr>
+                <w:sz w:val="16"/>
+              </w:rPr>
+            </w:r>
+            <w:r>
+              <w:rPr>
+                <w:sz w:val="16"/>
+              </w:rPr>
+              <w:t>「英文 11 209 词、中文 31 868 字」</w:t>
+            </w:r>
+          </w:p>
+        </w:tc>
+        <w:tc>
+          <w:tcPr>
+            <w:tcW w:type="dxa" w:w="2448"/>
+          </w:tcPr>
+          <w:p>
+            <w:pPr>
+              <w:spacing w:after="0"/>
+            </w:pPr>
+            <w:r>
+              <w:rPr>
+                <w:sz w:val="16"/>
+              </w:rPr>
+            </w:r>
+            <w:r>
+              <w:rPr>
+                <w:sz w:val="16"/>
+              </w:rPr>
+              <w:t>英文 12 761 词、中文 35 504 字</w:t>
+            </w:r>
+          </w:p>
+        </w:tc>
+        <w:tc>
+          <w:tcPr>
+            <w:tcW w:type="dxa" w:w="2448"/>
+          </w:tcPr>
+          <w:p>
+            <w:pPr>
+              <w:spacing w:after="0"/>
+            </w:pPr>
+            <w:r>
+              <w:rPr>
+                <w:sz w:val="16"/>
+              </w:rPr>
+            </w:r>
+            <w:r>
+              <w:rPr>
+                <w:sz w:val="16"/>
+              </w:rPr>
+              <w:t>陈旧数字：成文后多轮增补未回填</w:t>
+            </w:r>
+          </w:p>
+        </w:tc>
+      </w:tr>
+      <w:tr>
+        <w:tc>
+          <w:tcPr>
+            <w:tcW w:type="dxa" w:w="2448"/>
+          </w:tcPr>
+          <w:p>
+            <w:pPr>
+              <w:spacing w:after="0"/>
+            </w:pPr>
+            <w:r>
+              <w:rPr>
+                <w:sz w:val="16"/>
+              </w:rPr>
+            </w:r>
+            <w:r>
+              <w:rPr>
+                <w:sz w:val="16"/>
+              </w:rPr>
+              <w:t>自查表 F4</w:t>
+            </w:r>
+          </w:p>
+        </w:tc>
+        <w:tc>
+          <w:tcPr>
+            <w:tcW w:type="dxa" w:w="2448"/>
+          </w:tcPr>
+          <w:p>
+            <w:pPr>
+              <w:spacing w:after="0"/>
+            </w:pPr>
+            <w:r>
+              <w:rPr>
+                <w:sz w:val="16"/>
+              </w:rPr>
+            </w:r>
+            <w:r>
+              <w:rPr>
+                <w:sz w:val="16"/>
+              </w:rPr>
+              <w:t>「</w:t>
+            </w:r>
+            <w:r>
+              <w:rPr>
+                <w:rFonts w:ascii="Consolas" w:hAnsi="Consolas"/>
+                <w:sz w:val="16"/>
+              </w:rPr>
+              <w:t>补充材料_S1_S19/</w:t>
+            </w:r>
+            <w:r>
+              <w:rPr>
+                <w:sz w:val="16"/>
+              </w:rPr>
+              <w:t>：19 条目、40 文件」</w:t>
+            </w:r>
+          </w:p>
+        </w:tc>
+        <w:tc>
+          <w:tcPr>
+            <w:tcW w:type="dxa" w:w="2448"/>
+          </w:tcPr>
+          <w:p>
+            <w:pPr>
+              <w:spacing w:after="0"/>
+            </w:pPr>
+            <w:r>
+              <w:rPr>
+                <w:sz w:val="16"/>
+              </w:rPr>
+            </w:r>
+            <w:r>
+              <w:rPr>
+                <w:sz w:val="16"/>
+              </w:rPr>
+              <w:t>目录实为 S01–S26，58 个材料文件</w:t>
+            </w:r>
+          </w:p>
+        </w:tc>
+        <w:tc>
+          <w:tcPr>
+            <w:tcW w:type="dxa" w:w="2448"/>
+          </w:tcPr>
+          <w:p>
+            <w:pPr>
+              <w:spacing w:after="0"/>
+            </w:pPr>
+            <w:r>
+              <w:rPr>
+                <w:sz w:val="16"/>
+              </w:rPr>
+            </w:r>
+            <w:r>
+              <w:rPr>
+                <w:sz w:val="16"/>
+              </w:rPr>
+              <w:t>陈旧 + 目录名与内容不符</w:t>
+            </w:r>
+          </w:p>
+        </w:tc>
+      </w:tr>
+      <w:tr>
+        <w:tc>
+          <w:tcPr>
+            <w:tcW w:type="dxa" w:w="2448"/>
+          </w:tcPr>
+          <w:p>
+            <w:pPr>
+              <w:spacing w:after="0"/>
+            </w:pPr>
+            <w:r>
+              <w:rPr>
+                <w:sz w:val="16"/>
+              </w:rPr>
+            </w:r>
+            <w:r>
+              <w:rPr>
+                <w:sz w:val="16"/>
+              </w:rPr>
+              <w:t>自查表汇总表</w:t>
+            </w:r>
+          </w:p>
+        </w:tc>
+        <w:tc>
+          <w:tcPr>
+            <w:tcW w:type="dxa" w:w="2448"/>
+          </w:tcPr>
+          <w:p>
+            <w:pPr>
+              <w:spacing w:after="0"/>
+            </w:pPr>
+            <w:r>
+              <w:rPr>
+                <w:sz w:val="16"/>
+              </w:rPr>
+            </w:r>
+            <w:r>
+              <w:rPr>
+                <w:sz w:val="16"/>
+              </w:rPr>
+              <w:t>只有 A–F 六层，无 G 层</w:t>
+            </w:r>
+          </w:p>
+        </w:tc>
+        <w:tc>
+          <w:tcPr>
+            <w:tcW w:type="dxa" w:w="2448"/>
+          </w:tcPr>
+          <w:p>
+            <w:pPr>
+              <w:spacing w:after="0"/>
+            </w:pPr>
+            <w:r>
+              <w:rPr>
+                <w:sz w:val="16"/>
+              </w:rPr>
+            </w:r>
+            <w:r>
+              <w:rPr>
+                <w:sz w:val="16"/>
+              </w:rPr>
+              <w:t>正文含 G 层 6 项</w:t>
+            </w:r>
+          </w:p>
+        </w:tc>
+        <w:tc>
+          <w:tcPr>
+            <w:tcW w:type="dxa" w:w="2448"/>
+          </w:tcPr>
+          <w:p>
+            <w:pPr>
+              <w:spacing w:after="0"/>
+            </w:pPr>
+            <w:r>
+              <w:rPr>
+                <w:sz w:val="16"/>
+              </w:rPr>
+            </w:r>
+            <w:r>
+              <w:rPr>
+                <w:sz w:val="16"/>
+              </w:rPr>
+              <w:t>结构性遗漏：层级合计（59）与项目总数（65）对不上</w:t>
+            </w:r>
+          </w:p>
+        </w:tc>
+      </w:tr>
+      <w:tr>
+        <w:tc>
+          <w:tcPr>
+            <w:tcW w:type="dxa" w:w="2448"/>
+          </w:tcPr>
+          <w:p>
+            <w:pPr>
+              <w:spacing w:after="0"/>
+            </w:pPr>
+            <w:r>
+              <w:rPr>
+                <w:sz w:val="16"/>
+              </w:rPr>
+            </w:r>
+            <w:r>
+              <w:rPr>
+                <w:sz w:val="16"/>
+              </w:rPr>
+              <w:t>自查表结论段</w:t>
+            </w:r>
+          </w:p>
+        </w:tc>
+        <w:tc>
+          <w:tcPr>
+            <w:tcW w:type="dxa" w:w="2448"/>
+          </w:tcPr>
+          <w:p>
+            <w:pPr>
+              <w:spacing w:after="0"/>
+            </w:pPr>
+            <w:r>
+              <w:rPr>
+                <w:sz w:val="16"/>
+              </w:rPr>
+            </w:r>
+            <w:r>
+              <w:rPr>
+                <w:sz w:val="16"/>
+              </w:rPr>
+              <w:t>「缺失项（仅剩 1 项）」「部分通过项（10 项）」，并要求补 Dockerfile 与 CI</w:t>
+            </w:r>
+          </w:p>
+        </w:tc>
+        <w:tc>
+          <w:tcPr>
+            <w:tcW w:type="dxa" w:w="2448"/>
+          </w:tcPr>
+          <w:p>
+            <w:pPr>
+              <w:spacing w:after="0"/>
+            </w:pPr>
+            <w:r>
+              <w:rPr>
+                <w:sz w:val="16"/>
+              </w:rPr>
+            </w:r>
+            <w:r>
+              <w:rPr>
+                <w:sz w:val="16"/>
+              </w:rPr>
+              <w:t>缺失项为 0，F6/F7 早已完成</w:t>
+            </w:r>
+          </w:p>
+        </w:tc>
+        <w:tc>
+          <w:tcPr>
+            <w:tcW w:type="dxa" w:w="2448"/>
+          </w:tcPr>
+          <w:p>
+            <w:pPr>
+              <w:spacing w:after="0"/>
+            </w:pPr>
+            <w:r>
+              <w:rPr>
+                <w:sz w:val="16"/>
+              </w:rPr>
+            </w:r>
+            <w:r>
+              <w:rPr>
+                <w:sz w:val="16"/>
+              </w:rPr>
+              <w:t>整段停留在数轮之前的状态</w:t>
+            </w:r>
+          </w:p>
+        </w:tc>
+      </w:tr>
+    </w:tbl>
+    <w:p>
+      <w:pPr>
+        <w:spacing w:after="40"/>
+      </w:pPr>
+    </w:p>
+    <w:p>
+      <w:r>
+        <w:t>自查表是「用来证明稿件可靠」的文件，它自身自相矛盾，比稿件里少一个引用更伤——审稿人会顺着它怀疑整个证据链。</w:t>
+      </w:r>
+    </w:p>
+    <w:p>
+      <w:pPr>
+        <w:pStyle w:val="Heading2"/>
+      </w:pPr>
+      <w:r>
+        <w:t>处置</w:t>
+      </w:r>
+    </w:p>
+    <w:p>
+      <w:pPr>
+        <w:pStyle w:val="ListNumber"/>
+      </w:pPr>
+      <w:r>
+        <w:rPr>
+          <w:b/>
+        </w:rPr>
+        <w:t>重命名补充材料目录</w:t>
+      </w:r>
+      <w:r>
+        <w:t xml:space="preserve">为 </w:t>
+      </w:r>
+      <w:r>
+        <w:rPr>
+          <w:rFonts w:ascii="Consolas" w:hAnsi="Consolas"/>
+        </w:rPr>
+        <w:t>补充材料_S01_S26/</w:t>
+      </w:r>
+      <w:r>
+        <w:t>，与内部 S01–S26 编号对齐，并同步 4 个引用该路径的脚本。</w:t>
+      </w:r>
+    </w:p>
+    <w:p>
+      <w:pPr>
+        <w:pStyle w:val="ListNumber"/>
+      </w:pPr>
+      <w:r>
+        <w:rPr>
+          <w:b/>
+        </w:rPr>
+        <w:t>新增 `scripts/refresh_selfcheck_facts_v11.py`</w:t>
+      </w:r>
+      <w:r>
+        <w:t>：从磁盘实测词数、字数、图数、主表数、补充材料条目与文件数，并只改写「结果」与「证据」两列（保留检查项与判定标准），使表格可随时重算而不是手工维护。</w:t>
+      </w:r>
+    </w:p>
+    <w:p>
+      <w:pPr>
+        <w:pStyle w:val="ListNumber"/>
+      </w:pPr>
+      <w:r>
+        <w:rPr>
+          <w:b/>
+        </w:rPr>
+        <w:t>重写结论段</w:t>
+      </w:r>
+      <w:r>
+        <w:t>：改为与表格一致的 66 项 / 62 通过 / 4 部分通过 / 0 缺失，并把「那些没做但已在正文声明为局限的实验」单独列出，说明它们是局限而非缺陷。</w:t>
+      </w:r>
+    </w:p>
+    <w:p>
+      <w:pPr>
+        <w:pStyle w:val="ListNumber"/>
+      </w:pPr>
+      <w:r>
+        <w:rPr>
+          <w:b/>
+        </w:rPr>
+        <w:t>补齐 G 层汇总行</w:t>
+      </w:r>
+      <w:r>
+        <w:t>，使层级表合计 = 项目计数。</w:t>
+      </w:r>
+    </w:p>
+    <w:p>
+      <w:pPr>
+        <w:pStyle w:val="ListNumber"/>
+      </w:pPr>
+      <w:r>
+        <w:rPr>
+          <w:b/>
+        </w:rPr>
+        <w:t>新增 E9 中英数值一致</w:t>
+      </w:r>
+      <w:r>
+        <w:t xml:space="preserve"> 检查项。</w:t>
+      </w:r>
+    </w:p>
+    <w:p>
+      <w:pPr>
+        <w:pStyle w:val="ListNumber"/>
+      </w:pPr>
+      <w:r>
+        <w:rPr>
+          <w:b/>
+        </w:rPr>
+        <w:t>强化 `scripts/verify_selfcheck_counts_v7.py`</w:t>
+      </w:r>
+      <w:r>
+        <w:t xml:space="preserve">：把「层级表合计 = 逐项计数 = 汇总行 = 结论句」写成断言，并检查重复编号与补充材料覆盖，失败时以 </w:t>
+      </w:r>
+      <w:r>
+        <w:rPr>
+          <w:rFonts w:ascii="Consolas" w:hAnsi="Consolas"/>
+        </w:rPr>
+        <w:t>SELFCHECK_MISMATCH</w:t>
+      </w:r>
+      <w:r>
+        <w:t xml:space="preserve"> 退出；该脚本已接入验证闸门，闸门现含 </w:t>
+      </w:r>
+      <w:r>
+        <w:rPr>
+          <w:b/>
+        </w:rPr>
+        <w:t>11 类检查</w:t>
+      </w:r>
+      <w:r>
+        <w:t>。</w:t>
+      </w:r>
+    </w:p>
+    <w:p>
+      <w:pPr>
+        <w:pStyle w:val="Heading2"/>
+      </w:pPr>
+      <w:r>
+        <w:t>观察</w:t>
+      </w:r>
+    </w:p>
+    <w:p>
+      <w:r>
+        <w:t>本轮 5 处缺陷全部属于"辅助文档随时间腐化"：它们都不是写作错误，而是</w:t>
+      </w:r>
+      <w:r>
+        <w:rPr>
+          <w:b/>
+        </w:rPr>
+        <w:t>在成文之后新增证据、又只更新正文</w:t>
+      </w:r>
+      <w:r>
+        <w:t>造成的。这解释了为什么前十轮的脚本化检查（全部针对稿件）没能发现。结论是：凡是要对读者陈述事实的文件，都应该由脚本从产物重算，而不是手工维护。</w:t>
       </w:r>
     </w:p>
     <w:sectPr>

</xml_diff>

<commit_message>
Round 11b: keep the publication manifest in step with the release
</commit_message>
<xml_diff>
--- a/重构版论文_v4_20260915/遗漏问题审查报告.docx
+++ b/重构版论文_v4_20260915/遗漏问题审查报告.docx
@@ -13422,6 +13422,415 @@
       </w:r>
       <w:r>
         <w:t>造成的。这解释了为什么前十轮的脚本化检查（全部针对稿件）没能发现。结论是：凡是要对读者陈述事实的文件，都应该由脚本从产物重算，而不是手工维护。</w:t>
+      </w:r>
+    </w:p>
+    <w:p>
+      <w:pPr>
+        <w:pStyle w:val="Heading2"/>
+      </w:pPr>
+      <w:r>
+        <w:t>同轮续查（第六处）：发布清单 MANIFEST.json</w:t>
+      </w:r>
+    </w:p>
+    <w:p>
+      <w:r>
+        <w:t>顺着"辅助文档是否与产物一致"这条线继续查，发布清单里也有两处同类问题：</w:t>
+      </w:r>
+    </w:p>
+    <w:tbl>
+      <w:tblPr>
+        <w:tblStyle w:val="TableGrid"/>
+        <w:tblW w:type="auto" w:w="0"/>
+        <w:tblLook w:firstColumn="1" w:firstRow="1" w:lastColumn="0" w:lastRow="0" w:noHBand="0" w:noVBand="1" w:val="04A0"/>
+      </w:tblPr>
+      <w:tblGrid>
+        <w:gridCol w:w="2448"/>
+        <w:gridCol w:w="2448"/>
+        <w:gridCol w:w="2448"/>
+        <w:gridCol w:w="2448"/>
+      </w:tblGrid>
+      <w:tr>
+        <w:tc>
+          <w:tcPr>
+            <w:tcW w:type="dxa" w:w="2448"/>
+          </w:tcPr>
+          <w:p>
+            <w:pPr>
+              <w:spacing w:after="0"/>
+            </w:pPr>
+            <w:r>
+              <w:rPr>
+                <w:sz w:val="16"/>
+              </w:rPr>
+            </w:r>
+            <w:r>
+              <w:rPr>
+                <w:b/>
+                <w:sz w:val="16"/>
+              </w:rPr>
+              <w:t>位置</w:t>
+            </w:r>
+          </w:p>
+        </w:tc>
+        <w:tc>
+          <w:tcPr>
+            <w:tcW w:type="dxa" w:w="2448"/>
+          </w:tcPr>
+          <w:p>
+            <w:pPr>
+              <w:spacing w:after="0"/>
+            </w:pPr>
+            <w:r>
+              <w:rPr>
+                <w:sz w:val="16"/>
+              </w:rPr>
+            </w:r>
+            <w:r>
+              <w:rPr>
+                <w:b/>
+                <w:sz w:val="16"/>
+              </w:rPr>
+              <w:t>清单中的陈述</w:t>
+            </w:r>
+          </w:p>
+        </w:tc>
+        <w:tc>
+          <w:tcPr>
+            <w:tcW w:type="dxa" w:w="2448"/>
+          </w:tcPr>
+          <w:p>
+            <w:pPr>
+              <w:spacing w:after="0"/>
+            </w:pPr>
+            <w:r>
+              <w:rPr>
+                <w:sz w:val="16"/>
+              </w:rPr>
+            </w:r>
+            <w:r>
+              <w:rPr>
+                <w:b/>
+                <w:sz w:val="16"/>
+              </w:rPr>
+              <w:t>实际</w:t>
+            </w:r>
+          </w:p>
+        </w:tc>
+        <w:tc>
+          <w:tcPr>
+            <w:tcW w:type="dxa" w:w="2448"/>
+          </w:tcPr>
+          <w:p>
+            <w:pPr>
+              <w:spacing w:after="0"/>
+            </w:pPr>
+            <w:r>
+              <w:rPr>
+                <w:sz w:val="16"/>
+              </w:rPr>
+            </w:r>
+            <w:r>
+              <w:rPr>
+                <w:b/>
+                <w:sz w:val="16"/>
+              </w:rPr>
+              <w:t>性质</w:t>
+            </w:r>
+          </w:p>
+        </w:tc>
+      </w:tr>
+      <w:tr>
+        <w:tc>
+          <w:tcPr>
+            <w:tcW w:type="dxa" w:w="2448"/>
+          </w:tcPr>
+          <w:p>
+            <w:pPr>
+              <w:spacing w:after="0"/>
+            </w:pPr>
+            <w:r>
+              <w:rPr>
+                <w:sz w:val="16"/>
+              </w:rPr>
+            </w:r>
+            <w:r>
+              <w:rPr>
+                <w:rFonts w:ascii="Consolas" w:hAnsi="Consolas"/>
+                <w:sz w:val="16"/>
+              </w:rPr>
+              <w:t>public_release_tag</w:t>
+            </w:r>
+          </w:p>
+        </w:tc>
+        <w:tc>
+          <w:tcPr>
+            <w:tcW w:type="dxa" w:w="2448"/>
+          </w:tcPr>
+          <w:p>
+            <w:pPr>
+              <w:spacing w:after="0"/>
+            </w:pPr>
+            <w:r>
+              <w:rPr>
+                <w:sz w:val="16"/>
+              </w:rPr>
+            </w:r>
+            <w:r>
+              <w:rPr>
+                <w:rFonts w:ascii="Consolas" w:hAnsi="Consolas"/>
+                <w:sz w:val="16"/>
+              </w:rPr>
+              <w:t>v1.0.2</w:t>
+            </w:r>
+          </w:p>
+        </w:tc>
+        <w:tc>
+          <w:tcPr>
+            <w:tcW w:type="dxa" w:w="2448"/>
+          </w:tcPr>
+          <w:p>
+            <w:pPr>
+              <w:spacing w:after="0"/>
+            </w:pPr>
+            <w:r>
+              <w:rPr>
+                <w:sz w:val="16"/>
+              </w:rPr>
+            </w:r>
+            <w:r>
+              <w:rPr>
+                <w:sz w:val="16"/>
+              </w:rPr>
+              <w:t xml:space="preserve">实际发布标签已到 </w:t>
+            </w:r>
+            <w:r>
+              <w:rPr>
+                <w:rFonts w:ascii="Consolas" w:hAnsi="Consolas"/>
+                <w:sz w:val="16"/>
+              </w:rPr>
+              <w:t>v1.10.0</w:t>
+            </w:r>
+          </w:p>
+        </w:tc>
+        <w:tc>
+          <w:tcPr>
+            <w:tcW w:type="dxa" w:w="2448"/>
+          </w:tcPr>
+          <w:p>
+            <w:pPr>
+              <w:spacing w:after="0"/>
+            </w:pPr>
+            <w:r>
+              <w:rPr>
+                <w:sz w:val="16"/>
+              </w:rPr>
+            </w:r>
+            <w:r>
+              <w:rPr>
+                <w:sz w:val="16"/>
+              </w:rPr>
+              <w:t>字面量写死，八个版本未更新</w:t>
+            </w:r>
+          </w:p>
+        </w:tc>
+      </w:tr>
+      <w:tr>
+        <w:tc>
+          <w:tcPr>
+            <w:tcW w:type="dxa" w:w="2448"/>
+          </w:tcPr>
+          <w:p>
+            <w:pPr>
+              <w:spacing w:after="0"/>
+            </w:pPr>
+            <w:r>
+              <w:rPr>
+                <w:sz w:val="16"/>
+              </w:rPr>
+            </w:r>
+            <w:r>
+              <w:rPr>
+                <w:rFonts w:ascii="Consolas" w:hAnsi="Consolas"/>
+                <w:sz w:val="16"/>
+              </w:rPr>
+              <w:t>canonical_manuscript</w:t>
+            </w:r>
+          </w:p>
+        </w:tc>
+        <w:tc>
+          <w:tcPr>
+            <w:tcW w:type="dxa" w:w="2448"/>
+          </w:tcPr>
+          <w:p>
+            <w:pPr>
+              <w:spacing w:after="0"/>
+            </w:pPr>
+            <w:r>
+              <w:rPr>
+                <w:sz w:val="16"/>
+              </w:rPr>
+            </w:r>
+            <w:r>
+              <w:rPr>
+                <w:rFonts w:ascii="Consolas" w:hAnsi="Consolas"/>
+                <w:sz w:val="16"/>
+              </w:rPr>
+              <w:t>results_paper_materials_v3/english_sci_manuscript_final.docx</w:t>
+            </w:r>
+          </w:p>
+        </w:tc>
+        <w:tc>
+          <w:tcPr>
+            <w:tcW w:type="dxa" w:w="2448"/>
+          </w:tcPr>
+          <w:p>
+            <w:pPr>
+              <w:spacing w:after="0"/>
+            </w:pPr>
+            <w:r>
+              <w:rPr>
+                <w:sz w:val="16"/>
+              </w:rPr>
+            </w:r>
+            <w:r>
+              <w:rPr>
+                <w:sz w:val="16"/>
+              </w:rPr>
+              <w:t xml:space="preserve">当前正稿为 </w:t>
+            </w:r>
+            <w:r>
+              <w:rPr>
+                <w:rFonts w:ascii="Consolas" w:hAnsi="Consolas"/>
+                <w:sz w:val="16"/>
+              </w:rPr>
+              <w:t>重构版论文_v4_20260915/English_SCI_Manuscript_v4.docx</w:t>
+            </w:r>
+          </w:p>
+        </w:tc>
+        <w:tc>
+          <w:tcPr>
+            <w:tcW w:type="dxa" w:w="2448"/>
+          </w:tcPr>
+          <w:p>
+            <w:pPr>
+              <w:spacing w:after="0"/>
+            </w:pPr>
+            <w:r>
+              <w:rPr>
+                <w:sz w:val="16"/>
+              </w:rPr>
+            </w:r>
+            <w:r>
+              <w:rPr>
+                <w:sz w:val="16"/>
+              </w:rPr>
+              <w:t>指向已被取代的旧稿</w:t>
+            </w:r>
+          </w:p>
+        </w:tc>
+      </w:tr>
+    </w:tbl>
+    <w:p>
+      <w:pPr>
+        <w:spacing w:after="40"/>
+      </w:pPr>
+    </w:p>
+    <w:p>
+      <w:r>
+        <w:t>处置：</w:t>
+      </w:r>
+    </w:p>
+    <w:p>
+      <w:pPr>
+        <w:pStyle w:val="ListNumber"/>
+      </w:pPr>
+      <w:r>
+        <w:rPr>
+          <w:rFonts w:ascii="Consolas" w:hAnsi="Consolas"/>
+        </w:rPr>
+        <w:t>build_publication_manifest.py</w:t>
+      </w:r>
+      <w:r>
+        <w:t xml:space="preserve"> 改为</w:t>
+      </w:r>
+      <w:r>
+        <w:rPr>
+          <w:b/>
+        </w:rPr>
+        <w:t>从 git 标签推导</w:t>
+      </w:r>
+      <w:r>
+        <w:t xml:space="preserve"> </w:t>
+      </w:r>
+      <w:r>
+        <w:rPr>
+          <w:rFonts w:ascii="Consolas" w:hAnsi="Consolas"/>
+        </w:rPr>
+        <w:t>public_release_tag</w:t>
+      </w:r>
+      <w:r>
+        <w:t>（失败时回退到稿件引用的标签），不再写死版本号；</w:t>
+      </w:r>
+      <w:r>
+        <w:rPr>
+          <w:rFonts w:ascii="Consolas" w:hAnsi="Consolas"/>
+        </w:rPr>
+        <w:t>canonical_manuscript</w:t>
+      </w:r>
+      <w:r>
+        <w:t xml:space="preserve"> 改指 v4 正稿，并新增 </w:t>
+      </w:r>
+      <w:r>
+        <w:rPr>
+          <w:rFonts w:ascii="Consolas" w:hAnsi="Consolas"/>
+        </w:rPr>
+        <w:t>canonical_manuscript_zh</w:t>
+      </w:r>
+      <w:r>
+        <w:t>；同时把两份 v4 文档加入哈希清单。</w:t>
+      </w:r>
+    </w:p>
+    <w:p>
+      <w:pPr>
+        <w:pStyle w:val="ListNumber"/>
+      </w:pPr>
+      <w:r>
+        <w:t xml:space="preserve">新增 </w:t>
+      </w:r>
+      <w:r>
+        <w:rPr>
+          <w:rFonts w:ascii="Consolas" w:hAnsi="Consolas"/>
+        </w:rPr>
+        <w:t>scripts/check_publication_manifest_v12.py</w:t>
+      </w:r>
+      <w:r>
+        <w:t>：校验清单标签 = 最新标签 = 稿件引用标签，校验 canonical 路径为正稿，并</w:t>
+      </w:r>
+      <w:r>
+        <w:rPr>
+          <w:b/>
+        </w:rPr>
+        <w:t>逐条重算清单中全部 80 个 SHA-256</w:t>
+      </w:r>
+      <w:r>
+        <w:t>。任何一份产物被改动而清单未重建，都会在提交前失败。</w:t>
+      </w:r>
+    </w:p>
+    <w:p>
+      <w:pPr>
+        <w:pStyle w:val="ListNumber"/>
+      </w:pPr>
+      <w:r>
+        <w:t xml:space="preserve">该检查并入验证闸门，闸门现含 </w:t>
+      </w:r>
+      <w:r>
+        <w:rPr>
+          <w:b/>
+        </w:rPr>
+        <w:t>12 类检查</w:t>
+      </w:r>
+      <w:r>
+        <w:t>。</w:t>
       </w:r>
     </w:p>
     <w:sectPr>

</xml_diff>

<commit_message>
Round 11d: fix the graphical abstract title and the public metadata
</commit_message>
<xml_diff>
--- a/重构版论文_v4_20260915/遗漏问题审查报告.docx
+++ b/重构版论文_v4_20260915/遗漏问题审查报告.docx
@@ -14321,6 +14321,635 @@
       </w:r>
       <w:r>
         <w:t>。</w:t>
+      </w:r>
+    </w:p>
+    <w:p>
+      <w:pPr>
+        <w:pStyle w:val="Heading2"/>
+      </w:pPr>
+      <w:r>
+        <w:t>同轮续查（第八处）：图形摘要与公开仓库元数据</w:t>
+      </w:r>
+    </w:p>
+    <w:p>
+      <w:r>
+        <w:t>第八项是本轮最不该出现的一处：</w:t>
+      </w:r>
+      <w:r>
+        <w:rPr>
+          <w:b/>
+        </w:rPr>
+        <w:t>图形摘要的标题仍是已被本文数据证伪的旧标题</w:t>
+      </w:r>
+      <w:r>
+        <w:t>。</w:t>
+      </w:r>
+    </w:p>
+    <w:tbl>
+      <w:tblPr>
+        <w:tblStyle w:val="TableGrid"/>
+        <w:tblW w:type="auto" w:w="0"/>
+        <w:tblLook w:firstColumn="1" w:firstRow="1" w:lastColumn="0" w:lastRow="0" w:noHBand="0" w:noVBand="1" w:val="04A0"/>
+      </w:tblPr>
+      <w:tblGrid>
+        <w:gridCol w:w="3264"/>
+        <w:gridCol w:w="3264"/>
+        <w:gridCol w:w="3264"/>
+      </w:tblGrid>
+      <w:tr>
+        <w:tc>
+          <w:tcPr>
+            <w:tcW w:type="dxa" w:w="3264"/>
+          </w:tcPr>
+          <w:p>
+            <w:pPr>
+              <w:spacing w:after="0"/>
+            </w:pPr>
+            <w:r>
+              <w:rPr>
+                <w:sz w:val="16"/>
+              </w:rPr>
+            </w:r>
+            <w:r>
+              <w:rPr>
+                <w:b/>
+                <w:sz w:val="16"/>
+              </w:rPr>
+              <w:t>文档</w:t>
+            </w:r>
+          </w:p>
+        </w:tc>
+        <w:tc>
+          <w:tcPr>
+            <w:tcW w:type="dxa" w:w="3264"/>
+          </w:tcPr>
+          <w:p>
+            <w:pPr>
+              <w:spacing w:after="0"/>
+            </w:pPr>
+            <w:r>
+              <w:rPr>
+                <w:sz w:val="16"/>
+              </w:rPr>
+            </w:r>
+            <w:r>
+              <w:rPr>
+                <w:b/>
+                <w:sz w:val="16"/>
+              </w:rPr>
+              <w:t>问题</w:t>
+            </w:r>
+          </w:p>
+        </w:tc>
+        <w:tc>
+          <w:tcPr>
+            <w:tcW w:type="dxa" w:w="3264"/>
+          </w:tcPr>
+          <w:p>
+            <w:pPr>
+              <w:spacing w:after="0"/>
+            </w:pPr>
+            <w:r>
+              <w:rPr>
+                <w:sz w:val="16"/>
+              </w:rPr>
+            </w:r>
+            <w:r>
+              <w:rPr>
+                <w:b/>
+                <w:sz w:val="16"/>
+              </w:rPr>
+              <w:t>处置</w:t>
+            </w:r>
+          </w:p>
+        </w:tc>
+      </w:tr>
+      <w:tr>
+        <w:tc>
+          <w:tcPr>
+            <w:tcW w:type="dxa" w:w="3264"/>
+          </w:tcPr>
+          <w:p>
+            <w:pPr>
+              <w:spacing w:after="0"/>
+            </w:pPr>
+            <w:r>
+              <w:rPr>
+                <w:sz w:val="16"/>
+              </w:rPr>
+            </w:r>
+            <w:r>
+              <w:rPr>
+                <w:rFonts w:ascii="Consolas" w:hAnsi="Consolas"/>
+                <w:sz w:val="16"/>
+              </w:rPr>
+              <w:t>Graphical_Abstract_v4.png/pdf</w:t>
+            </w:r>
+          </w:p>
+        </w:tc>
+        <w:tc>
+          <w:tcPr>
+            <w:tcW w:type="dxa" w:w="3264"/>
+          </w:tcPr>
+          <w:p>
+            <w:pPr>
+              <w:spacing w:after="0"/>
+            </w:pPr>
+            <w:r>
+              <w:rPr>
+                <w:sz w:val="16"/>
+              </w:rPr>
+            </w:r>
+            <w:r>
+              <w:rPr>
+                <w:sz w:val="16"/>
+              </w:rPr>
+              <w:t xml:space="preserve">大标题「Protocol sensitivity dominates </w:t>
+            </w:r>
+            <w:r>
+              <w:rPr>
+                <w:b/>
+                <w:sz w:val="16"/>
+              </w:rPr>
+              <w:t>model choice</w:t>
+            </w:r>
+            <w:r>
+              <w:rPr>
+                <w:sz w:val="16"/>
+              </w:rPr>
+              <w:t xml:space="preserve"> in flow-based NIDS」——第九轮已把稿件标题收窄为 aggregation-rule differences，图形摘要未同步</w:t>
+            </w:r>
+          </w:p>
+        </w:tc>
+        <w:tc>
+          <w:tcPr>
+            <w:tcW w:type="dxa" w:w="3264"/>
+          </w:tcPr>
+          <w:p>
+            <w:pPr>
+              <w:spacing w:after="0"/>
+            </w:pPr>
+            <w:r>
+              <w:rPr>
+                <w:sz w:val="16"/>
+              </w:rPr>
+            </w:r>
+            <w:r>
+              <w:rPr>
+                <w:sz w:val="16"/>
+              </w:rPr>
+              <w:t>重绘，标题改为「…dominates aggregation-rule differences…」</w:t>
+            </w:r>
+          </w:p>
+        </w:tc>
+      </w:tr>
+      <w:tr>
+        <w:tc>
+          <w:tcPr>
+            <w:tcW w:type="dxa" w:w="3264"/>
+          </w:tcPr>
+          <w:p>
+            <w:pPr>
+              <w:spacing w:after="0"/>
+            </w:pPr>
+            <w:r>
+              <w:rPr>
+                <w:sz w:val="16"/>
+              </w:rPr>
+            </w:r>
+            <w:r>
+              <w:rPr>
+                <w:rFonts w:ascii="Consolas" w:hAnsi="Consolas"/>
+                <w:sz w:val="16"/>
+              </w:rPr>
+              <w:t>Graphical_Abstract_v4.png/pdf</w:t>
+            </w:r>
+          </w:p>
+        </w:tc>
+        <w:tc>
+          <w:tcPr>
+            <w:tcW w:type="dxa" w:w="3264"/>
+          </w:tcPr>
+          <w:p>
+            <w:pPr>
+              <w:spacing w:after="0"/>
+            </w:pPr>
+            <w:r>
+              <w:rPr>
+                <w:sz w:val="16"/>
+              </w:rPr>
+            </w:r>
+            <w:r>
+              <w:rPr>
+                <w:sz w:val="16"/>
+              </w:rPr>
+              <w:t xml:space="preserve">面板 C 注记「margins exceed the perturbation bound by about </w:t>
+            </w:r>
+            <w:r>
+              <w:rPr>
+                <w:b/>
+                <w:sz w:val="16"/>
+              </w:rPr>
+              <w:t>3,500x</w:t>
+            </w:r>
+            <w:r>
+              <w:rPr>
+                <w:sz w:val="16"/>
+              </w:rPr>
+              <w:t>」</w:t>
+            </w:r>
+          </w:p>
+        </w:tc>
+        <w:tc>
+          <w:tcPr>
+            <w:tcW w:type="dxa" w:w="3264"/>
+          </w:tcPr>
+          <w:p>
+            <w:pPr>
+              <w:spacing w:after="0"/>
+            </w:pPr>
+            <w:r>
+              <w:rPr>
+                <w:sz w:val="16"/>
+              </w:rPr>
+            </w:r>
+            <w:r>
+              <w:rPr>
+                <w:sz w:val="16"/>
+              </w:rPr>
+              <w:t>改为「3,469-5,038x」</w:t>
+            </w:r>
+          </w:p>
+        </w:tc>
+      </w:tr>
+      <w:tr>
+        <w:tc>
+          <w:tcPr>
+            <w:tcW w:type="dxa" w:w="3264"/>
+          </w:tcPr>
+          <w:p>
+            <w:pPr>
+              <w:spacing w:after="0"/>
+            </w:pPr>
+            <w:r>
+              <w:rPr>
+                <w:sz w:val="16"/>
+              </w:rPr>
+            </w:r>
+            <w:r>
+              <w:rPr>
+                <w:rFonts w:ascii="Consolas" w:hAnsi="Consolas"/>
+                <w:sz w:val="16"/>
+              </w:rPr>
+              <w:t>README.md</w:t>
+            </w:r>
+          </w:p>
+        </w:tc>
+        <w:tc>
+          <w:tcPr>
+            <w:tcW w:type="dxa" w:w="3264"/>
+          </w:tcPr>
+          <w:p>
+            <w:pPr>
+              <w:spacing w:after="0"/>
+            </w:pPr>
+            <w:r>
+              <w:rPr>
+                <w:sz w:val="16"/>
+              </w:rPr>
+            </w:r>
+            <w:r>
+              <w:rPr>
+                <w:sz w:val="16"/>
+              </w:rPr>
+              <w:t xml:space="preserve">「Submission release: </w:t>
+            </w:r>
+            <w:r>
+              <w:rPr>
+                <w:rFonts w:ascii="Consolas" w:hAnsi="Consolas"/>
+                <w:sz w:val="16"/>
+              </w:rPr>
+              <w:t>v1.0.2</w:t>
+            </w:r>
+            <w:r>
+              <w:rPr>
+                <w:sz w:val="16"/>
+              </w:rPr>
+              <w:t>（tag present in the local checkout; verify the remote tag before submission）」</w:t>
+            </w:r>
+          </w:p>
+        </w:tc>
+        <w:tc>
+          <w:tcPr>
+            <w:tcW w:type="dxa" w:w="3264"/>
+          </w:tcPr>
+          <w:p>
+            <w:pPr>
+              <w:spacing w:after="0"/>
+            </w:pPr>
+            <w:r>
+              <w:rPr>
+                <w:sz w:val="16"/>
+              </w:rPr>
+            </w:r>
+            <w:r>
+              <w:rPr>
+                <w:sz w:val="16"/>
+              </w:rPr>
+              <w:t xml:space="preserve">改为 </w:t>
+            </w:r>
+            <w:r>
+              <w:rPr>
+                <w:rFonts w:ascii="Consolas" w:hAnsi="Consolas"/>
+                <w:sz w:val="16"/>
+              </w:rPr>
+              <w:t>v1.10.0</w:t>
+            </w:r>
+            <w:r>
+              <w:rPr>
+                <w:sz w:val="16"/>
+              </w:rPr>
+              <w:t>，并写明已推送</w:t>
+            </w:r>
+          </w:p>
+        </w:tc>
+      </w:tr>
+      <w:tr>
+        <w:tc>
+          <w:tcPr>
+            <w:tcW w:type="dxa" w:w="3264"/>
+          </w:tcPr>
+          <w:p>
+            <w:pPr>
+              <w:spacing w:after="0"/>
+            </w:pPr>
+            <w:r>
+              <w:rPr>
+                <w:sz w:val="16"/>
+              </w:rPr>
+            </w:r>
+            <w:r>
+              <w:rPr>
+                <w:rFonts w:ascii="Consolas" w:hAnsi="Consolas"/>
+                <w:sz w:val="16"/>
+              </w:rPr>
+              <w:t>README.md</w:t>
+            </w:r>
+          </w:p>
+        </w:tc>
+        <w:tc>
+          <w:tcPr>
+            <w:tcW w:type="dxa" w:w="3264"/>
+          </w:tcPr>
+          <w:p>
+            <w:pPr>
+              <w:spacing w:after="0"/>
+            </w:pPr>
+            <w:r>
+              <w:rPr>
+                <w:sz w:val="16"/>
+              </w:rPr>
+            </w:r>
+            <w:r>
+              <w:rPr>
+                <w:sz w:val="16"/>
+              </w:rPr>
+              <w:t>首段引用的稿件标题是 *Provenance-Aware and Uncertainty-Aware Evaluation…*——一份</w:t>
+            </w:r>
+            <w:r>
+              <w:rPr>
+                <w:b/>
+                <w:sz w:val="16"/>
+              </w:rPr>
+              <w:t>已不存在的旧稿</w:t>
+            </w:r>
+          </w:p>
+        </w:tc>
+        <w:tc>
+          <w:tcPr>
+            <w:tcW w:type="dxa" w:w="3264"/>
+          </w:tcPr>
+          <w:p>
+            <w:pPr>
+              <w:spacing w:after="0"/>
+            </w:pPr>
+            <w:r>
+              <w:rPr>
+                <w:sz w:val="16"/>
+              </w:rPr>
+            </w:r>
+            <w:r>
+              <w:rPr>
+                <w:sz w:val="16"/>
+              </w:rPr>
+              <w:t>改为当前标题</w:t>
+            </w:r>
+          </w:p>
+        </w:tc>
+      </w:tr>
+      <w:tr>
+        <w:tc>
+          <w:tcPr>
+            <w:tcW w:type="dxa" w:w="3264"/>
+          </w:tcPr>
+          <w:p>
+            <w:pPr>
+              <w:spacing w:after="0"/>
+            </w:pPr>
+            <w:r>
+              <w:rPr>
+                <w:sz w:val="16"/>
+              </w:rPr>
+            </w:r>
+            <w:r>
+              <w:rPr>
+                <w:rFonts w:ascii="Consolas" w:hAnsi="Consolas"/>
+                <w:sz w:val="16"/>
+              </w:rPr>
+              <w:t>CITATION.cff</w:t>
+            </w:r>
+          </w:p>
+        </w:tc>
+        <w:tc>
+          <w:tcPr>
+            <w:tcW w:type="dxa" w:w="3264"/>
+          </w:tcPr>
+          <w:p>
+            <w:pPr>
+              <w:spacing w:after="0"/>
+            </w:pPr>
+            <w:r>
+              <w:rPr>
+                <w:sz w:val="16"/>
+              </w:rPr>
+            </w:r>
+            <w:r>
+              <w:rPr>
+                <w:rFonts w:ascii="Consolas" w:hAnsi="Consolas"/>
+                <w:sz w:val="16"/>
+              </w:rPr>
+              <w:t>version: "1.2.0"</w:t>
+            </w:r>
+            <w:r>
+              <w:rPr>
+                <w:sz w:val="16"/>
+              </w:rPr>
+              <w:t>、</w:t>
+            </w:r>
+            <w:r>
+              <w:rPr>
+                <w:rFonts w:ascii="Consolas" w:hAnsi="Consolas"/>
+                <w:sz w:val="16"/>
+              </w:rPr>
+              <w:t>date-released: 2026-09-16</w:t>
+            </w:r>
+            <w:r>
+              <w:rPr>
+                <w:sz w:val="16"/>
+              </w:rPr>
+              <w:t>，标题为泛化描述</w:t>
+            </w:r>
+          </w:p>
+        </w:tc>
+        <w:tc>
+          <w:tcPr>
+            <w:tcW w:type="dxa" w:w="3264"/>
+          </w:tcPr>
+          <w:p>
+            <w:pPr>
+              <w:spacing w:after="0"/>
+            </w:pPr>
+            <w:r>
+              <w:rPr>
+                <w:sz w:val="16"/>
+              </w:rPr>
+            </w:r>
+            <w:r>
+              <w:rPr>
+                <w:sz w:val="16"/>
+              </w:rPr>
+              <w:t>版本改为 1.10.0、日期更新、标题指向当前稿件</w:t>
+            </w:r>
+          </w:p>
+        </w:tc>
+      </w:tr>
+      <w:tr>
+        <w:tc>
+          <w:tcPr>
+            <w:tcW w:type="dxa" w:w="3264"/>
+          </w:tcPr>
+          <w:p>
+            <w:pPr>
+              <w:spacing w:after="0"/>
+            </w:pPr>
+            <w:r>
+              <w:rPr>
+                <w:sz w:val="16"/>
+              </w:rPr>
+            </w:r>
+            <w:r>
+              <w:rPr>
+                <w:rFonts w:ascii="Consolas" w:hAnsi="Consolas"/>
+                <w:sz w:val="16"/>
+              </w:rPr>
+              <w:t>docs/</w:t>
+            </w:r>
+            <w:r>
+              <w:rPr>
+                <w:sz w:val="16"/>
+              </w:rPr>
+              <w:t xml:space="preserve"> 下 5 份「看起来仍有效」的历史文档</w:t>
+            </w:r>
+          </w:p>
+        </w:tc>
+        <w:tc>
+          <w:tcPr>
+            <w:tcW w:type="dxa" w:w="3264"/>
+          </w:tcPr>
+          <w:p>
+            <w:pPr>
+              <w:spacing w:after="0"/>
+            </w:pPr>
+            <w:r>
+              <w:rPr>
+                <w:sz w:val="16"/>
+              </w:rPr>
+            </w:r>
+            <w:r>
+              <w:rPr>
+                <w:rFonts w:ascii="Consolas" w:hAnsi="Consolas"/>
+                <w:sz w:val="16"/>
+              </w:rPr>
+              <w:t>final_submission_gate_v2</w:t>
+            </w:r>
+            <w:r>
+              <w:rPr>
+                <w:sz w:val="16"/>
+              </w:rPr>
+              <w:t xml:space="preserve"> 仍写「稿件当前引用 tag v1.0.2」「参考文献 24 条」「补充材料 S1–S15」</w:t>
+            </w:r>
+          </w:p>
+        </w:tc>
+        <w:tc>
+          <w:tcPr>
+            <w:tcW w:type="dxa" w:w="3264"/>
+          </w:tcPr>
+          <w:p>
+            <w:pPr>
+              <w:spacing w:after="0"/>
+            </w:pPr>
+            <w:r>
+              <w:rPr>
+                <w:sz w:val="16"/>
+              </w:rPr>
+            </w:r>
+            <w:r>
+              <w:rPr>
+                <w:sz w:val="16"/>
+              </w:rPr>
+              <w:t>统一加历史记录状态说明</w:t>
+            </w:r>
+          </w:p>
+        </w:tc>
+      </w:tr>
+    </w:tbl>
+    <w:p>
+      <w:pPr>
+        <w:spacing w:after="40"/>
+      </w:pPr>
+    </w:p>
+    <w:p>
+      <w:r>
+        <w:t>图形摘要会被编辑与审稿人</w:t>
+      </w:r>
+      <w:r>
+        <w:rPr>
+          <w:b/>
+        </w:rPr>
+        <w:t>先于正文</w:t>
+      </w:r>
+      <w:r>
+        <w:t>看到，它宣示一个正文已经否定的结论，是这份材料里传播风险最高的一处不一致。</w:t>
+      </w:r>
+    </w:p>
+    <w:p>
+      <w:r>
+        <w:rPr>
+          <w:rFonts w:ascii="Consolas" w:hAnsi="Consolas"/>
+        </w:rPr>
+        <w:t>build_graphical_abstract_v5.py</w:t>
+      </w:r>
+      <w:r>
+        <w:t xml:space="preserve"> 原先只输出 PNG，PDF 属于游离产物，现已改为同时输出 PNG 与 PDF，二者同源。</w:t>
+      </w:r>
+      <w:r>
+        <w:rPr>
+          <w:rFonts w:ascii="Consolas" w:hAnsi="Consolas"/>
+        </w:rPr>
+        <w:t>check_aux_documents_v13.py</w:t>
+      </w:r>
+      <w:r>
+        <w:t xml:space="preserve"> 相应增加了图形摘要源码与公开元数据的检查：源码不得出现旧标题或 3,500，README 不得出现旧标签与旧标题，CITATION.cff 版本必须等于最新标签。</w:t>
       </w:r>
     </w:p>
     <w:sectPr>

</xml_diff>

<commit_message>
Round 11e: make the results-directory supplementary a verified mirror
</commit_message>
<xml_diff>
--- a/重构版论文_v4_20260915/遗漏问题审查报告.docx
+++ b/重构版论文_v4_20260915/遗漏问题审查报告.docx
@@ -14950,6 +14950,194 @@
       </w:r>
       <w:r>
         <w:t xml:space="preserve"> 相应增加了图形摘要源码与公开元数据的检查：源码不得出现旧标题或 3,500，README 不得出现旧标签与旧标题，CITATION.cff 版本必须等于最新标签。</w:t>
+      </w:r>
+    </w:p>
+    <w:p>
+      <w:pPr>
+        <w:pStyle w:val="Heading2"/>
+      </w:pPr>
+      <w:r>
+        <w:t>同轮续查（第九处）：仓库里仍留着被取代的补充材料目录</w:t>
+      </w:r>
+    </w:p>
+    <w:p>
+      <w:r>
+        <w:rPr>
+          <w:rFonts w:ascii="Consolas" w:hAnsi="Consolas"/>
+        </w:rPr>
+        <w:t>results_publication_final/supplementary/</w:t>
+      </w:r>
+      <w:r>
+        <w:t xml:space="preserve"> 里放的还是</w:t>
+      </w:r>
+      <w:r>
+        <w:rPr>
+          <w:b/>
+        </w:rPr>
+        <w:t>早期命名</w:t>
+      </w:r>
+      <w:r>
+        <w:t>的补充材料（</w:t>
+      </w:r>
+      <w:r>
+        <w:rPr>
+          <w:rFonts w:ascii="Consolas" w:hAnsi="Consolas"/>
+        </w:rPr>
+        <w:t>S1_cic_cfrg_class_report.csv</w:t>
+      </w:r>
+      <w:r>
+        <w:t xml:space="preserve"> … </w:t>
+      </w:r>
+      <w:r>
+        <w:rPr>
+          <w:rFonts w:ascii="Consolas" w:hAnsi="Consolas"/>
+        </w:rPr>
+        <w:t>S15_temperature_calibration.csv</w:t>
+      </w:r>
+      <w:r>
+        <w:t xml:space="preserve">），而稿件与正式成册目录用的是 </w:t>
+      </w:r>
+      <w:r>
+        <w:rPr>
+          <w:rFonts w:ascii="Consolas" w:hAnsi="Consolas"/>
+        </w:rPr>
+        <w:t>S01</w:t>
+      </w:r>
+      <w:r>
+        <w:t>–</w:t>
+      </w:r>
+      <w:r>
+        <w:rPr>
+          <w:rFonts w:ascii="Consolas" w:hAnsi="Consolas"/>
+        </w:rPr>
+        <w:t>S26</w:t>
+      </w:r>
+      <w:r>
+        <w:t xml:space="preserve">。结果是：任何人（包括导师、审稿人、未来的自己）下载 </w:t>
+      </w:r>
+      <w:r>
+        <w:rPr>
+          <w:rFonts w:ascii="Consolas" w:hAnsi="Consolas"/>
+        </w:rPr>
+        <w:t>results_publication_final/</w:t>
+      </w:r>
+      <w:r>
+        <w:t xml:space="preserve"> 之后，看到的补充材料与论文清单</w:t>
+      </w:r>
+      <w:r>
+        <w:rPr>
+          <w:b/>
+        </w:rPr>
+        <w:t>对不上</w:t>
+      </w:r>
+      <w:r>
+        <w:t>，且无法判断哪一份是当前的。</w:t>
+      </w:r>
+    </w:p>
+    <w:p>
+      <w:r>
+        <w:t>处置：把该目录改成</w:t>
+      </w:r>
+      <w:r>
+        <w:rPr>
+          <w:b/>
+        </w:rPr>
+        <w:t>由规范化目录生成的镜像</w:t>
+      </w:r>
+      <w:r>
+        <w:t>。</w:t>
+      </w:r>
+    </w:p>
+    <w:p>
+      <w:pPr>
+        <w:pStyle w:val="ListNumber"/>
+      </w:pPr>
+      <w:r>
+        <w:t xml:space="preserve">新增 </w:t>
+      </w:r>
+      <w:r>
+        <w:rPr>
+          <w:rFonts w:ascii="Consolas" w:hAnsi="Consolas"/>
+        </w:rPr>
+        <w:t>scripts/sync_supplementary_mirror_v16.py</w:t>
+      </w:r>
+      <w:r>
+        <w:t xml:space="preserve">：默认从 </w:t>
+      </w:r>
+      <w:r>
+        <w:rPr>
+          <w:rFonts w:ascii="Consolas" w:hAnsi="Consolas"/>
+        </w:rPr>
+        <w:t>重构版论文_v4_20260915/补充材料_S01_S26/</w:t>
+      </w:r>
+      <w:r>
+        <w:t xml:space="preserve"> 同步，</w:t>
+      </w:r>
+      <w:r>
+        <w:rPr>
+          <w:rFonts w:ascii="Consolas" w:hAnsi="Consolas"/>
+        </w:rPr>
+        <w:t>--check</w:t>
+      </w:r>
+      <w:r>
+        <w:t xml:space="preserve"> 只做校验。脚本在动手前校验目标路径确实位于仓库内的 </w:t>
+      </w:r>
+      <w:r>
+        <w:rPr>
+          <w:rFonts w:ascii="Consolas" w:hAnsi="Consolas"/>
+        </w:rPr>
+        <w:t>results_publication_final/supplementary</w:t>
+      </w:r>
+      <w:r>
+        <w:t>，避免误删。</w:t>
+      </w:r>
+    </w:p>
+    <w:p>
+      <w:pPr>
+        <w:pStyle w:val="ListNumber"/>
+      </w:pPr>
+      <w:r>
+        <w:t>同步后镜像为 60 个文件（58 个材料文件 + 索引 + 校验清单），旧命名文件不再存在。</w:t>
+      </w:r>
+    </w:p>
+    <w:p>
+      <w:pPr>
+        <w:pStyle w:val="ListNumber"/>
+      </w:pPr>
+      <w:r>
+        <w:t xml:space="preserve">校验器并入闸门：逐文件比对两侧的 SHA-256，出现新增、缺失或改动即报 </w:t>
+      </w:r>
+      <w:r>
+        <w:rPr>
+          <w:rFonts w:ascii="Consolas" w:hAnsi="Consolas"/>
+        </w:rPr>
+        <w:t>SUPPLEMENTARY_MIRROR_MISMATCH</w:t>
+      </w:r>
+      <w:r>
+        <w:t xml:space="preserve">。闸门现含 </w:t>
+      </w:r>
+      <w:r>
+        <w:rPr>
+          <w:b/>
+        </w:rPr>
+        <w:t>14 类检查</w:t>
+      </w:r>
+      <w:r>
+        <w:t>。</w:t>
+      </w:r>
+    </w:p>
+    <w:p>
+      <w:r>
+        <w:t>这条与第十一处（发布清单）、第十处（补充材料目录名）同源：</w:t>
+      </w:r>
+      <w:r>
+        <w:rPr>
+          <w:b/>
+        </w:rPr>
+        <w:t>同一个事实在仓库里存了多份，只有一份被更新</w:t>
+      </w:r>
+      <w:r>
+        <w:t>。至此本项目里所有"同一事实多副本"的位置都已改为「单一来源 + 自动派生 + 闸门校验」。</w:t>
       </w:r>
     </w:p>
     <w:sectPr>

</xml_diff>